<commit_message>
Revise manuscript: embed figures, add numbered citations and bibliography
Rewrite MANUSCRIPT.md with inline figures (6 main + 7 supplementary),
numbered in-text citations [1]-[22], and a full bibliography section.
Regenerate MANUSCRIPT.docx with all figures embedded (28KB → 1.4MB).

Co-Authored-By: Claude Opus 4.6 <noreply@anthropic.com>
</commit_message>
<xml_diff>
--- a/projects/annotation_gap_discovery/MANUSCRIPT.docx
+++ b/projects/annotation_gap_discovery/MANUSCRIPT.docx
@@ -2,7 +2,7 @@
 <file path=word/document.xml><?xml version="1.0" encoding="utf-8"?>
 <w:document xmlns:w="http://schemas.openxmlformats.org/wordprocessingml/2006/main" xmlns:m="http://schemas.openxmlformats.org/officeDocument/2006/math" xmlns:r="http://schemas.openxmlformats.org/officeDocument/2006/relationships" xmlns:o="urn:schemas-microsoft-com:office:office" xmlns:v="urn:schemas-microsoft-com:vml" xmlns:w10="urn:schemas-microsoft-com:office:word" xmlns:a="http://schemas.openxmlformats.org/drawingml/2006/main" xmlns:pic="http://schemas.openxmlformats.org/drawingml/2006/picture" xmlns:wp="http://schemas.openxmlformats.org/drawingml/2006/wordprocessingDrawing">
   <w:body>
-    <w:bookmarkStart w:id="58" w:name="X47231a4e12ac2ae38f460a93bf749e17e52f408"/>
+    <w:bookmarkStart w:id="102" w:name="X47231a4e12ac2ae38f460a93bf749e17e52f408"/>
     <w:p>
       <w:pPr>
         <w:pStyle w:val="Heading1"/>
@@ -154,7 +154,7 @@
         <w:pStyle w:val="FirstParagraph"/>
       </w:pPr>
       <w:r>
-        <w:t xml:space="preserve">The construction of genome-scale metabolic models (GEMs) from sequenced bacterial genomes has become a cornerstone of computational systems biology, enabling predictions of growth phenotypes, metabolic flux distributions, and gene essentiality (Henry et al., 2010; Thiele and Palsson, 2010). However, the accuracy of these models is fundamentally limited by the quality of the underlying genome annotations. Automated annotation pipelines such as RAST (Aziz et al., 2008), Prokka (Seemann, 2014), and Bakta (Schwengers et al., 2021) assign functions to 60–80% of predicted genes, leaving substantial fractions of the proteome functionally unannotated.</w:t>
+        <w:t xml:space="preserve">The construction of genome-scale metabolic models (GEMs) from sequenced bacterial genomes has become a cornerstone of computational systems biology, enabling predictions of growth phenotypes, metabolic flux distributions, and gene essentiality [1, 2]. However, the accuracy of these models is fundamentally limited by the quality of the underlying genome annotations. Automated annotation pipelines such as RAST [3], Prokka [4], and Bakta [5] assign functions to 60–80% of predicted genes, leaving substantial fractions of the proteome functionally unannotated.</w:t>
       </w:r>
     </w:p>
     <w:p>
@@ -175,7 +175,7 @@
         <w:t xml:space="preserve">gapfilling</w:t>
       </w:r>
       <w:r>
-        <w:t xml:space="preserve">: the computational addition of biochemical reactions from a reference database to restore model-phenotype concordance (Orth and Palsson, 2010; Kumar et al., 2007). Each gapfilled reaction represents a function that the organism performs but for which no gene has been identified — an</w:t>
+        <w:t xml:space="preserve">: the computational addition of biochemical reactions from a reference database to restore model-phenotype concordance [6, 7]. Each gapfilled reaction represents a function that the organism performs but for which no gene has been identified — an</w:t>
       </w:r>
       <w:r>
         <w:t xml:space="preserve"> </w:t>
@@ -195,15 +195,15 @@
         <w:pStyle w:val="BodyText"/>
       </w:pPr>
       <w:r>
-        <w:t xml:space="preserve">The scale of this problem is significant. A typical draft bacterial GEM may require 10–50 gapfilled reactions to match observed growth profiles, and across the approximately 300,000 bacterial genomes with pangenome representation in GTDB-derived databases, the total number of annotation gaps likely numbers in the millions. While many gapfilled reactions may reflect genuine biological novelty — novel enzyme families, moonlighting proteins, or non-homologous isofunctional enzymes (NISEs) (Omelchenko et al., 2010) — a substantial fraction likely represents recoverable annotation failures: genes that encode the required function but were missed or misannotated by automated pipelines.</w:t>
-      </w:r>
-    </w:p>
-    <w:p>
-      <w:pPr>
-        <w:pStyle w:val="BodyText"/>
-      </w:pPr>
-      <w:r>
-        <w:t xml:space="preserve">Several approaches have been developed to address annotation gaps individually. Fitness-based methods leverage high-throughput transposon mutagenesis (RB-TnSeq) to identify genes whose disruption affects growth under specific conditions (Wetmore et al., 2015; Price et al., 2018). The Fitness Browser database now contains genome-wide fitness data for 48 organisms across thousands of conditions, providing a rich resource for functional gene discovery (Price et al., 2018). GapMind provides independent pathway completeness predictions for carbon and amino acid utilization pathways (Price et al., 2020). Likelihood-based approaches use sequence homology to assign probabilistic gene-reaction associations during gap filling (Benedict et al., 2014). The gapseq tool combines curated pathway databases with informed gap-filling for metabolic model reconstruction (Zimmermann et al., 2021).</w:t>
+        <w:t xml:space="preserve">The scale of this problem is significant. A typical draft bacterial GEM may require 10–50 gapfilled reactions to match observed growth profiles, and across the approximately 300,000 bacterial genomes with pangenome representation in GTDB-derived databases, the total number of annotation gaps likely numbers in the millions. While many gapfilled reactions may reflect genuine biological novelty — novel enzyme families, moonlighting proteins, or non-homologous isofunctional enzymes (NISEs) [8] — a substantial fraction likely represents recoverable annotation failures: genes that encode the required function but were missed or misannotated by automated pipelines.</w:t>
+      </w:r>
+    </w:p>
+    <w:p>
+      <w:pPr>
+        <w:pStyle w:val="BodyText"/>
+      </w:pPr>
+      <w:r>
+        <w:t xml:space="preserve">Several approaches have been developed to address annotation gaps individually. Fitness-based methods leverage high-throughput transposon mutagenesis (RB-TnSeq) to identify genes whose disruption affects growth under specific conditions [9, 10]. The Fitness Browser database now contains genome-wide fitness data for 48 organisms across thousands of conditions, providing a rich resource for functional gene discovery [10]. GapMind provides independent pathway completeness predictions for carbon and amino acid utilization pathways [11]. Likelihood-based approaches use sequence homology to assign probabilistic gene-reaction associations during gap filling [12]. The gapseq tool combines curated pathway databases with informed gap-filling for metabolic model reconstruction [13]. More recently, machine-learning approaches have been applied to RB-TnSeq fitness data to identify functional gene modules [14].</w:t>
       </w:r>
     </w:p>
     <w:p>
@@ -253,7 +253,7 @@
         <w:pStyle w:val="FirstParagraph"/>
       </w:pPr>
       <w:r>
-        <w:t xml:space="preserve">This study integrates data from three primary database collections within the KBase BER Data Lakehouse (BERDL), an on-premises Delta Lakehouse accessible via Apache Spark SQL on a JupyterHub compute environment.</w:t>
+        <w:t xml:space="preserve">This study integrates data from three primary database collections within the KBase BER Data Lakehouse (BERDL) [15], an on-premises Delta Lakehouse accessible via Apache Spark SQL on a JupyterHub compute environment.</w:t>
       </w:r>
     </w:p>
     <w:p>
@@ -280,7 +280,7 @@
         <w:t xml:space="preserve">kescience_fitnessbrowser</w:t>
       </w:r>
       <w:r>
-        <w:t xml:space="preserve">): Contains genome-wide RB-TnSeq fitness data for 48 bacterial organisms across approximately 27 million fitness measurements. Key tables include</w:t>
+        <w:t xml:space="preserve">): Contains genome-wide RB-TnSeq fitness data for 48 bacterial organisms across approximately 27 million fitness measurements [9, 10]. Key tables include</w:t>
       </w:r>
       <w:r>
         <w:t xml:space="preserve"> </w:t>
@@ -457,7 +457,7 @@
         <w:t xml:space="preserve"> </w:t>
       </w:r>
       <w:r>
-        <w:t xml:space="preserve">(alternative EC, UniRef, and product annotations), and</w:t>
+        <w:t xml:space="preserve">(alternative EC, UniRef, and product annotations) [5], and</w:t>
       </w:r>
       <w:r>
         <w:t xml:space="preserve"> </w:t>
@@ -472,7 +472,7 @@
         <w:t xml:space="preserve"> </w:t>
       </w:r>
       <w:r>
-        <w:t xml:space="preserve">(GapMind pathway completeness predictions per genome). GapMind</w:t>
+        <w:t xml:space="preserve">(GapMind pathway completeness predictions per genome) [11]. GapMind</w:t>
       </w:r>
       <w:r>
         <w:t xml:space="preserve"> </w:t>
@@ -514,7 +514,7 @@
         <w:t xml:space="preserve">kbase_msd_biochemistry</w:t>
       </w:r>
       <w:r>
-        <w:t xml:space="preserve">): Contains 56,000 reactions and 46,000 compounds with full stoichiometry, used as the reference biochemistry for model building and gapfilling.</w:t>
+        <w:t xml:space="preserve">): Contains 56,000 reactions and 46,000 compounds with full stoichiometry [1], used as the reference biochemistry for model building and gapfilling.</w:t>
       </w:r>
     </w:p>
     <w:p>
@@ -529,7 +529,7 @@
         <w:t xml:space="preserve">External resources</w:t>
       </w:r>
       <w:r>
-        <w:t xml:space="preserve">: Swiss-Prot reviewed protein sequences were retrieved from the UniProt REST API for DIAMOND BLAST analysis. DIAMOND v2.1.16 (Buchfink et al., 2015) was used for sequence homology searches.</w:t>
+        <w:t xml:space="preserve">: Swiss-Prot reviewed protein sequences were retrieved from the UniProt REST API for DIAMOND BLAST analysis. DIAMOND v2.1.16 [16] was used for sequence homology searches.</w:t>
       </w:r>
     </w:p>
     <w:bookmarkEnd w:id="23"/>
@@ -583,7 +583,7 @@
         <w:pStyle w:val="FirstParagraph"/>
       </w:pPr>
       <w:r>
-        <w:t xml:space="preserve">Draft genome-scale metabolic models were constructed for each organism using ModelSEEDpy from RAST genome annotations. Models were exported in SBML format and analyzed using COBRApy (Ebrahim et al., 2013). For each organism-carbon source combination, flux balance analysis (FBA) was performed on minimal media containing the target carbon source as the sole carbon and energy source, with standard mineral salts and cofactors. Growth was predicted as positive if the objective flux (biomass production) exceeded 0.001 mmol/gDW/h.</w:t>
+        <w:t xml:space="preserve">Draft genome-scale metabolic models were constructed for each organism using ModelSEEDpy from RAST genome annotations [1, 3]. Models were exported in SBML format and analyzed using COBRApy [17]. For each organism-carbon source combination, flux balance analysis (FBA) was performed on minimal media containing the target carbon source as the sole carbon and energy source, with standard mineral salts and cofactors. Growth was predicted as positive if the objective flux (biomass production) exceeded 0.001 mmol/gDW/h.</w:t>
       </w:r>
     </w:p>
     <w:p>
@@ -609,7 +609,7 @@
         <w:pStyle w:val="FirstParagraph"/>
       </w:pPr>
       <w:r>
-        <w:t xml:space="preserve">For each false-negative case (observed growth, predicted no-growth), conditional gapfilling was performed using ModelSEEDpy’s gapfilling algorithm, which identifies a minimal set of reactions from the ModelSEED reference database whose addition to the model enables growth. The gapfilling was conditioned on the specific carbon source medium, ensuring that added reactions are necessary for utilization of that substrate.</w:t>
+        <w:t xml:space="preserve">For each false-negative case (observed growth, predicted no-growth), conditional gapfilling was performed using ModelSEEDpy’s gapfilling algorithm [1], which identifies a minimal set of reactions from the ModelSEED reference database whose addition to the model enables growth. The gapfilling was conditioned on the specific carbon source medium, ensuring that added reactions are necessary for utilization of that substrate.</w:t>
       </w:r>
     </w:p>
     <w:p>
@@ -747,7 +747,7 @@
         <w:t xml:space="preserve"> </w:t>
       </w:r>
       <w:r>
-        <w:t xml:space="preserve">table for candidate genes under relevant carbon source experiments. Genes with fitness scores below -2.0 and |t-statistic| above 4.0 were classified as</w:t>
+        <w:t xml:space="preserve">table for candidate genes under relevant carbon source experiments [9, 10]. Genes with fitness scores below -2.0 and |t-statistic| above 4.0 were classified as</w:t>
       </w:r>
       <w:r>
         <w:t xml:space="preserve"> </w:t>
@@ -851,15 +851,15 @@
         <w:pStyle w:val="FirstParagraph"/>
       </w:pPr>
       <w:r>
-        <w:t xml:space="preserve">GapMind pathway completeness predictions were retrieved for all 14 focal genomes and their clade relatives. For 31 of 38 gapfilled cases with mappable GapMind pathways (via a manually curated carbon-source-to-pathway mapping), concordance between GapMind incompleteness and gapfilling requirements was assessed.</w:t>
-      </w:r>
-    </w:p>
-    <w:p>
-      <w:pPr>
-        <w:pStyle w:val="BodyText"/>
-      </w:pPr>
-      <w:r>
-        <w:t xml:space="preserve">For reactions not resolved by EC matching (including the 50 dark reactions), Bakta annotations were queried as an alternative functional annotation source. Bakta annotations include EC numbers, KEGG orthology assignments, and product descriptions derived from independent annotation pipelines. This yielded 1,459 Bakta EC candidate entries and resolved an additional 22 reaction-organism pairs (10.9% incremental resolution). UniRef identifiers extracted from Bakta annotations (54,549 entries) were used to seed exemplar sequence retrieval for BLAST analysis.</w:t>
+        <w:t xml:space="preserve">GapMind pathway completeness predictions [11] were retrieved for all 14 focal genomes and their clade relatives. For 31 of 38 gapfilled cases with mappable GapMind pathways (via a manually curated carbon-source-to-pathway mapping), concordance between GapMind incompleteness and gapfilling requirements was assessed.</w:t>
+      </w:r>
+    </w:p>
+    <w:p>
+      <w:pPr>
+        <w:pStyle w:val="BodyText"/>
+      </w:pPr>
+      <w:r>
+        <w:t xml:space="preserve">For reactions not resolved by EC matching (including the 50 dark reactions), Bakta annotations [5] were queried as an alternative functional annotation source. Bakta annotations include EC numbers, KEGG orthology assignments, and product descriptions derived from independent annotation pipelines. This yielded 1,459 Bakta EC candidate entries and resolved an additional 22 reaction-organism pairs (10.9% incremental resolution). UniRef identifiers extracted from Bakta annotations (54,549 entries) were used to seed exemplar sequence retrieval for BLAST analysis.</w:t>
       </w:r>
     </w:p>
     <w:bookmarkEnd w:id="28"/>
@@ -903,7 +903,7 @@
         <w:pStyle w:val="FirstParagraph"/>
       </w:pPr>
       <w:r>
-        <w:t xml:space="preserve">For each unique EC number associated with gapfilled reactions, up to 5 reviewed bacterial Swiss-Prot sequences were retrieved from the UniProt REST API, yielding 328 exemplar sequences covering 75 of 84 unique ECs (9 ECs had no Swiss-Prot representation). Target proteomes from all 14 organisms (67,377 total protein sequences from RAST annotations) were concatenated into a single FASTA file with organism-prefixed headers and indexed as a DIAMOND database.</w:t>
+        <w:t xml:space="preserve">For each unique EC number associated with gapfilled reactions, up to 5 reviewed bacterial Swiss-Prot sequences were retrieved from the UniProt REST API, yielding 328 exemplar sequences covering 75 of 84 unique ECs (9 ECs had no Swiss-Prot representation). Target proteomes from all 14 organisms (67,377 total protein sequences from RAST annotations) were concatenated into a single FASTA file with organism-prefixed headers and indexed as a DIAMOND database [16].</w:t>
       </w:r>
     </w:p>
     <w:p>
@@ -1075,7 +1075,7 @@
         <w:pStyle w:val="FirstParagraph"/>
       </w:pPr>
       <w:r>
-        <w:t xml:space="preserve">Two validation approaches were applied:</w:t>
+        <w:t xml:space="preserve">Three validation approaches were applied:</w:t>
       </w:r>
     </w:p>
     <w:p>
@@ -1105,7 +1105,7 @@
         <w:t xml:space="preserve">Gene knockout simulation</w:t>
       </w:r>
       <w:r>
-        <w:t xml:space="preserve">: For 23 high/medium-confidence NB03 candidates, gene-protein-reaction (GPR) rules were inserted into the SBML models. Single-gene knockout simulations were performed using COBRApy to test whether removing the candidate gene eliminated growth on the target carbon source. Results were inconclusive due to the circular dependency: the gapfilled reactions are themselves required for growth on carbon source minimal media, so wildtype growth was zero on these media even before knockout.</w:t>
+        <w:t xml:space="preserve">: For 23 high/medium-confidence NB03 candidates, gene-protein-reaction (GPR) rules were inserted into the SBML models. Single-gene knockout simulations were performed using COBRApy [17] to test whether removing the candidate gene eliminated growth on the target carbon source. Results were inconclusive due to the circular dependency: the gapfilled reactions are themselves required for growth on carbon source minimal media, so wildtype growth was zero on these media even before knockout.</w:t>
       </w:r>
     </w:p>
     <w:p>
@@ -1120,7 +1120,7 @@
         <w:t xml:space="preserve">Threshold sensitivity analysis</w:t>
       </w:r>
       <w:r>
-        <w:t xml:space="preserve">: The full pipeline was re-run under 240 combinations of fitness thresholds (FIT_THRESHOLD in {-1.0, -1.5, -2.0, -2.5, -3.0}; T_THRESHOLD in {3.0, 4.0, 5.0}) and BLAST quality thresholds (minimum identity in {25%, 30%, 35%, 40%}; minimum coverage in {50%, 60%, 70%, 80%}) to assess robustness of the resolution rate to parameter choice.</w:t>
+        <w:t xml:space="preserve">: The full pipeline was re-run under 240 combinations of fitness thresholds (FIT_THRESHOLD in {-1.0, -1.5, -2.0, -2.5, -3.0}; T_THRESHOLD in {3.0, 4.0, 5.0}) and BLAST quality thresholds (minimum identity in {25%, 30%, 35%, 40%}; minimum coverage in {50%, 60%, 70%, 80%}) to assess robustness of the resolution rate to parameter choice (Supplementary Figure S1).</w:t>
       </w:r>
     </w:p>
     <w:bookmarkEnd w:id="32"/>
@@ -1138,7 +1138,7 @@
         <w:pStyle w:val="FirstParagraph"/>
       </w:pPr>
       <w:r>
-        <w:t xml:space="preserve">All Spark SQL queries (NB01–NB05) were executed on the BERDL JupyterHub cluster with direct access to the Delta Lakehouse. Local analysis (NB06–NB08, supplementary notebook) was performed using Python 3.10+ with COBRApy 0.29.0, ModelSEEDpy, pandas, numpy, matplotlib, seaborn, and DIAMOND 2.1.16. Complete analysis requires approximately 5 hours of compute time (2–4 hours for model building, ~45 minutes for BLAST, remainder for queries and analysis).</w:t>
+        <w:t xml:space="preserve">All Spark SQL queries (NB01–NB05) were executed on the BERDL JupyterHub cluster with direct access to the Delta Lakehouse [15]. Local analysis (NB06–NB08, supplementary notebook) was performed using Python 3.10+ with COBRApy 0.29.0 [17], ModelSEEDpy, pandas, numpy, matplotlib, seaborn, and DIAMOND 2.1.16 [16]. Complete analysis requires approximately 5 hours of compute time (2–4 hours for model building, ~45 minutes for BLAST, remainder for queries and analysis).</w:t>
       </w:r>
     </w:p>
     <w:p>
@@ -1150,7 +1150,7 @@
     </w:p>
     <w:bookmarkEnd w:id="33"/>
     <w:bookmarkEnd w:id="34"/>
-    <w:bookmarkStart w:id="43" w:name="results"/>
+    <w:bookmarkStart w:id="60" w:name="results"/>
     <w:p>
       <w:pPr>
         <w:pStyle w:val="Heading2"/>
@@ -1159,7 +1159,7 @@
         <w:t xml:space="preserve">3. Results</w:t>
       </w:r>
     </w:p>
-    <w:bookmarkStart w:id="35" w:name="pipeline-overview-and-resolution-rate"/>
+    <w:bookmarkStart w:id="38" w:name="pipeline-overview-and-resolution-rate"/>
     <w:p>
       <w:pPr>
         <w:pStyle w:val="Heading3"/>
@@ -1178,14 +1178,79 @@
     </w:p>
     <w:p>
       <w:pPr>
+        <w:pStyle w:val="CaptionedFigure"/>
+      </w:pPr>
+      <w:r>
+        <w:drawing>
+          <wp:inline>
+            <wp:extent cx="5334000" cy="2239884"/>
+            <wp:effectExtent b="0" l="0" r="0" t="0"/>
+            <wp:docPr descr="Figure 1. Annotation gap resolution overview. Left panel: Cumulative resolution rate across evidence integration stages, showing progression from NB03 EC-based matching (25.4%) through NB04 Bakta annotations (36.3%) to NB06 BLAST homology (47.8%). Right panel: Confidence distribution of the 201 reaction-organism pairs — 44 high confidence (21.9%), 19 medium (9.5%), 33 low (16.4%), and 105 unresolved (52.2%). The dashed line indicates the pre-specified H1 threshold of 30%." title="" id="36" name="Picture"/>
+            <a:graphic>
+              <a:graphicData uri="http://schemas.openxmlformats.org/drawingml/2006/picture">
+                <pic:pic>
+                  <pic:nvPicPr>
+                    <pic:cNvPr descr="figures/fig1_resolution_overview.png" id="37" name="Picture"/>
+                    <pic:cNvPicPr>
+                      <a:picLocks noChangeArrowheads="1" noChangeAspect="1"/>
+                    </pic:cNvPicPr>
+                  </pic:nvPicPr>
+                  <pic:blipFill>
+                    <a:blip r:embed="rId35"/>
+                    <a:stretch>
+                      <a:fillRect/>
+                    </a:stretch>
+                  </pic:blipFill>
+                  <pic:spPr bwMode="auto">
+                    <a:xfrm>
+                      <a:off x="0" y="0"/>
+                      <a:ext cx="5334000" cy="2239884"/>
+                    </a:xfrm>
+                    <a:prstGeom prst="rect">
+                      <a:avLst/>
+                    </a:prstGeom>
+                    <a:noFill/>
+                    <a:ln w="9525">
+                      <a:noFill/>
+                      <a:headEnd/>
+                      <a:tailEnd/>
+                    </a:ln>
+                  </pic:spPr>
+                </pic:pic>
+              </a:graphicData>
+            </a:graphic>
+          </wp:inline>
+        </w:drawing>
+      </w:r>
+    </w:p>
+    <w:p>
+      <w:pPr>
+        <w:pStyle w:val="ImageCaption"/>
+      </w:pPr>
+      <w:r>
+        <w:rPr>
+          <w:bCs/>
+          <w:b/>
+        </w:rPr>
+        <w:t xml:space="preserve">Figure 1. Annotation gap resolution overview.</w:t>
+      </w:r>
+      <w:r>
+        <w:t xml:space="preserve"> </w:t>
+      </w:r>
+      <w:r>
+        <w:t xml:space="preserve">Left panel: Cumulative resolution rate across evidence integration stages, showing progression from NB03 EC-based matching (25.4%) through NB04 Bakta annotations (36.3%) to NB06 BLAST homology (47.8%). Right panel: Confidence distribution of the 201 reaction-organism pairs — 44 high confidence (21.9%), 19 medium (9.5%), 33 low (16.4%), and 105 unresolved (52.2%). The dashed line indicates the pre-specified H1 threshold of 30%.</w:t>
+      </w:r>
+    </w:p>
+    <w:p>
+      <w:pPr>
         <w:pStyle w:val="BodyText"/>
       </w:pPr>
       <w:r>
         <w:t xml:space="preserve">The 96 resolved pairs were distributed across confidence tiers: 44 high confidence (21.9%), 19 medium confidence (9.5%), and 33 low confidence (16.4%). The remaining 105 pairs (52.2%) were unresolved — no evidence stream identified a convincing gene candidate. The high-confidence fraction (21.9%) closely matches the 15–25% range predicted in the research plan.</w:t>
       </w:r>
     </w:p>
-    <w:bookmarkEnd w:id="35"/>
-    <w:bookmarkStart w:id="36" w:name="evidence-stream-contributions"/>
+    <w:bookmarkEnd w:id="38"/>
+    <w:bookmarkStart w:id="42" w:name="evidence-stream-contributions"/>
     <w:p>
       <w:pPr>
         <w:pStyle w:val="Heading3"/>
@@ -1204,6 +1269,71 @@
     </w:p>
     <w:p>
       <w:pPr>
+        <w:pStyle w:val="CaptionedFigure"/>
+      </w:pPr>
+      <w:r>
+        <w:drawing>
+          <wp:inline>
+            <wp:extent cx="5334000" cy="2202946"/>
+            <wp:effectExtent b="0" l="0" r="0" t="0"/>
+            <wp:docPr descr="Figure 2. Cross-validation of evidence stream contributions. Left panel: Leave-one-out analysis showing the resolution rate when each evidence stream is removed in turn. Right panel: Single-stream resolution rates showing each stream’s independent contribution. BLAST alone achieves 34.8% — the highest single-stream performance — but the full pipeline adds 13 percentage points through evidence integration. Removing any single stream still keeps resolution above 36%, demonstrating robustness." title="" id="40" name="Picture"/>
+            <a:graphic>
+              <a:graphicData uri="http://schemas.openxmlformats.org/drawingml/2006/picture">
+                <pic:pic>
+                  <pic:nvPicPr>
+                    <pic:cNvPr descr="figures/fig2_cross_validation.png" id="41" name="Picture"/>
+                    <pic:cNvPicPr>
+                      <a:picLocks noChangeArrowheads="1" noChangeAspect="1"/>
+                    </pic:cNvPicPr>
+                  </pic:nvPicPr>
+                  <pic:blipFill>
+                    <a:blip r:embed="rId39"/>
+                    <a:stretch>
+                      <a:fillRect/>
+                    </a:stretch>
+                  </pic:blipFill>
+                  <pic:spPr bwMode="auto">
+                    <a:xfrm>
+                      <a:off x="0" y="0"/>
+                      <a:ext cx="5334000" cy="2202946"/>
+                    </a:xfrm>
+                    <a:prstGeom prst="rect">
+                      <a:avLst/>
+                    </a:prstGeom>
+                    <a:noFill/>
+                    <a:ln w="9525">
+                      <a:noFill/>
+                      <a:headEnd/>
+                      <a:tailEnd/>
+                    </a:ln>
+                  </pic:spPr>
+                </pic:pic>
+              </a:graphicData>
+            </a:graphic>
+          </wp:inline>
+        </w:drawing>
+      </w:r>
+    </w:p>
+    <w:p>
+      <w:pPr>
+        <w:pStyle w:val="ImageCaption"/>
+      </w:pPr>
+      <w:r>
+        <w:rPr>
+          <w:bCs/>
+          <w:b/>
+        </w:rPr>
+        <w:t xml:space="preserve">Figure 2. Cross-validation of evidence stream contributions.</w:t>
+      </w:r>
+      <w:r>
+        <w:t xml:space="preserve"> </w:t>
+      </w:r>
+      <w:r>
+        <w:t xml:space="preserve">Left panel: Leave-one-out analysis showing the resolution rate when each evidence stream is removed in turn. Right panel: Single-stream resolution rates showing each stream’s independent contribution. BLAST alone achieves 34.8% — the highest single-stream performance — but the full pipeline adds 13 percentage points through evidence integration. Removing any single stream still keeps resolution above 36%, demonstrating robustness.</w:t>
+      </w:r>
+    </w:p>
+    <w:p>
+      <w:pPr>
         <w:pStyle w:val="BodyText"/>
       </w:pPr>
       <w:r>
@@ -1218,8 +1348,8 @@
         <w:t xml:space="preserve">Of the 96 resolved pairs, 47 (49%) had evidence from two or more streams, while 49 (51%) relied on a single stream. The two-or-more-stream subset was enriched for high-confidence assignments (40 of 47 high/medium-confidence pairs had multi-stream support), confirming that evidence triangulation improves confidence beyond what any single stream provides.</w:t>
       </w:r>
     </w:p>
-    <w:bookmarkEnd w:id="36"/>
-    <w:bookmarkStart w:id="37" w:name="organism-level-resolution"/>
+    <w:bookmarkEnd w:id="42"/>
+    <w:bookmarkStart w:id="46" w:name="organism-level-resolution"/>
     <w:p>
       <w:pPr>
         <w:pStyle w:val="Heading3"/>
@@ -1266,6 +1396,87 @@
       </w:r>
       <w:r>
         <w:t xml:space="preserve">(5 of 7 pairs) (Figure 3; Table 1).</w:t>
+      </w:r>
+    </w:p>
+    <w:p>
+      <w:pPr>
+        <w:pStyle w:val="CaptionedFigure"/>
+      </w:pPr>
+      <w:r>
+        <w:drawing>
+          <wp:inline>
+            <wp:extent cx="5334000" cy="3725704"/>
+            <wp:effectExtent b="0" l="0" r="0" t="0"/>
+            <wp:docPr descr="Figure 3. Per-organism resolution rates. Stacked bar chart showing the number of gapfilled reaction-organism pairs resolved at each confidence level (high, medium, low) and the number remaining unresolved for each of the 14 organisms. Organisms are ordered by decreasing resolution rate. The Bacteroidetes representative B. thetaiotaomicron shows the lowest resolution (20%), consistent with its phylogenetic distance from the Proteobacteria-dominated reference databases." title="" id="44" name="Picture"/>
+            <a:graphic>
+              <a:graphicData uri="http://schemas.openxmlformats.org/drawingml/2006/picture">
+                <pic:pic>
+                  <pic:nvPicPr>
+                    <pic:cNvPr descr="figures/fig3_organism_resolution.png" id="45" name="Picture"/>
+                    <pic:cNvPicPr>
+                      <a:picLocks noChangeArrowheads="1" noChangeAspect="1"/>
+                    </pic:cNvPicPr>
+                  </pic:nvPicPr>
+                  <pic:blipFill>
+                    <a:blip r:embed="rId43"/>
+                    <a:stretch>
+                      <a:fillRect/>
+                    </a:stretch>
+                  </pic:blipFill>
+                  <pic:spPr bwMode="auto">
+                    <a:xfrm>
+                      <a:off x="0" y="0"/>
+                      <a:ext cx="5334000" cy="3725704"/>
+                    </a:xfrm>
+                    <a:prstGeom prst="rect">
+                      <a:avLst/>
+                    </a:prstGeom>
+                    <a:noFill/>
+                    <a:ln w="9525">
+                      <a:noFill/>
+                      <a:headEnd/>
+                      <a:tailEnd/>
+                    </a:ln>
+                  </pic:spPr>
+                </pic:pic>
+              </a:graphicData>
+            </a:graphic>
+          </wp:inline>
+        </w:drawing>
+      </w:r>
+    </w:p>
+    <w:p>
+      <w:pPr>
+        <w:pStyle w:val="ImageCaption"/>
+      </w:pPr>
+      <w:r>
+        <w:rPr>
+          <w:bCs/>
+          <w:b/>
+        </w:rPr>
+        <w:t xml:space="preserve">Figure 3. Per-organism resolution rates.</w:t>
+      </w:r>
+      <w:r>
+        <w:t xml:space="preserve"> </w:t>
+      </w:r>
+      <w:r>
+        <w:t xml:space="preserve">Stacked bar chart showing the number of gapfilled reaction-organism pairs resolved at each confidence level (high, medium, low) and the number remaining unresolved for each of the 14 organisms. Organisms are ordered by decreasing resolution rate. The Bacteroidetes representative</w:t>
+      </w:r>
+      <w:r>
+        <w:t xml:space="preserve"> </w:t>
+      </w:r>
+      <w:r>
+        <w:rPr>
+          <w:iCs/>
+          <w:i/>
+        </w:rPr>
+        <w:t xml:space="preserve">B. thetaiotaomicron</w:t>
+      </w:r>
+      <w:r>
+        <w:t xml:space="preserve"> </w:t>
+      </w:r>
+      <w:r>
+        <w:t xml:space="preserve">shows the lowest resolution (20%), consistent with its phylogenetic distance from the Proteobacteria-dominated reference databases.</w:t>
       </w:r>
     </w:p>
     <w:p>
@@ -2760,14 +2971,14 @@
         <w:t xml:space="preserve">— the only Bacteroidetes in the study — reflects its phylogenetic distance from the Proteobacteria-dominated reference databases. Its metabolic pathway repertoire includes many Bacteroidetes-specific enzymes that lack close Swiss-Prot exemplars and have limited representation in eggNOG/Bakta annotations calibrated primarily on Proteobacterial genomes.</w:t>
       </w:r>
     </w:p>
-    <w:bookmarkEnd w:id="37"/>
-    <w:bookmarkStart w:id="38" w:name="dominant-resolved-reactions"/>
+    <w:bookmarkEnd w:id="46"/>
+    <w:bookmarkStart w:id="50" w:name="Xd459c2173b515a88abb4c814dfc5341bbcd5a44"/>
     <w:p>
       <w:pPr>
         <w:pStyle w:val="Heading3"/>
       </w:pPr>
       <w:r>
-        <w:t xml:space="preserve">3.4 Dominant Resolved Reactions</w:t>
+        <w:t xml:space="preserve">3.4 Dominant Resolved Reactions and BLAST Hit Quality</w:t>
       </w:r>
     </w:p>
     <w:p>
@@ -2775,7 +2986,72 @@
         <w:pStyle w:val="FirstParagraph"/>
       </w:pPr>
       <w:r>
-        <w:t xml:space="preserve">Two reactions dominated the high-confidence assignments (Figure 4). Reaction rxn02185 (2-acetolactate pyruvate-lyase, EC 2.2.1.6, branched-chain amino acid biosynthesis) and rxn03436 (acetohydroxy acid isomeroreductase, EC 1.1.1.86, valine/isoleucine biosynthesis) were each resolved with high confidence in 9 of 14 organisms. These enzymes catalyze sequential steps in the same biosynthetic pathway (the IlvB and IlvC steps of valine/isoleucine biosynthesis). Their consistent co-resolution validates the triangulation approach: when the BLAST homolog for one pathway step is identified, the adjacent step’s homolog is typically found in the same genomic neighborhood with comparable confidence.</w:t>
+        <w:t xml:space="preserve">Two reactions dominated the high-confidence assignments. Reaction rxn02185 (2-acetolactate pyruvate-lyase, EC 2.2.1.6, branched-chain amino acid biosynthesis) and rxn03436 (acetohydroxy acid isomeroreductase, EC 1.1.1.86, valine/isoleucine biosynthesis) were each resolved with high confidence in 9 of 14 organisms. These enzymes catalyze sequential steps in the same biosynthetic pathway (the IlvB and IlvC steps of valine/isoleucine biosynthesis). Their consistent co-resolution validates the triangulation approach: when the BLAST homolog for one pathway step is identified, the adjacent step’s homolog is typically found in the same genomic neighborhood with comparable confidence.</w:t>
+      </w:r>
+    </w:p>
+    <w:p>
+      <w:pPr>
+        <w:pStyle w:val="CaptionedFigure"/>
+      </w:pPr>
+      <w:r>
+        <w:drawing>
+          <wp:inline>
+            <wp:extent cx="5334000" cy="2198462"/>
+            <wp:effectExtent b="0" l="0" r="0" t="0"/>
+            <wp:docPr descr="Figure 4. BLAST hit quality and top resolved reactions. Left panel: Scatter plot of BLAST percent identity versus query coverage for 154 hits mapping to gapfilled reactions, colored by quality tier (high: identity &gt;= 30%, coverage &gt;= 70%, e-value &lt;= 1e-10; medium: identity &gt;= 25%, coverage &gt;= 50%, e-value &lt;= 1e-5). High-quality hits cluster in the upper-right quadrant. Right panel: Top 10 reactions by number of high-confidence BLAST hits, showing that branched-chain amino acid biosynthesis (rxn02185, rxn03436) and polyamine metabolism (rxn15947) dominate." title="" id="48" name="Picture"/>
+            <a:graphic>
+              <a:graphicData uri="http://schemas.openxmlformats.org/drawingml/2006/picture">
+                <pic:pic>
+                  <pic:nvPicPr>
+                    <pic:cNvPr descr="figures/fig4_blast_quality.png" id="49" name="Picture"/>
+                    <pic:cNvPicPr>
+                      <a:picLocks noChangeArrowheads="1" noChangeAspect="1"/>
+                    </pic:cNvPicPr>
+                  </pic:nvPicPr>
+                  <pic:blipFill>
+                    <a:blip r:embed="rId47"/>
+                    <a:stretch>
+                      <a:fillRect/>
+                    </a:stretch>
+                  </pic:blipFill>
+                  <pic:spPr bwMode="auto">
+                    <a:xfrm>
+                      <a:off x="0" y="0"/>
+                      <a:ext cx="5334000" cy="2198462"/>
+                    </a:xfrm>
+                    <a:prstGeom prst="rect">
+                      <a:avLst/>
+                    </a:prstGeom>
+                    <a:noFill/>
+                    <a:ln w="9525">
+                      <a:noFill/>
+                      <a:headEnd/>
+                      <a:tailEnd/>
+                    </a:ln>
+                  </pic:spPr>
+                </pic:pic>
+              </a:graphicData>
+            </a:graphic>
+          </wp:inline>
+        </w:drawing>
+      </w:r>
+    </w:p>
+    <w:p>
+      <w:pPr>
+        <w:pStyle w:val="ImageCaption"/>
+      </w:pPr>
+      <w:r>
+        <w:rPr>
+          <w:bCs/>
+          <w:b/>
+        </w:rPr>
+        <w:t xml:space="preserve">Figure 4. BLAST hit quality and top resolved reactions.</w:t>
+      </w:r>
+      <w:r>
+        <w:t xml:space="preserve"> </w:t>
+      </w:r>
+      <w:r>
+        <w:t xml:space="preserve">Left panel: Scatter plot of BLAST percent identity versus query coverage for 154 hits mapping to gapfilled reactions, colored by quality tier (high: identity &gt;= 30%, coverage &gt;= 70%, e-value &lt;= 1e-10; medium: identity &gt;= 25%, coverage &gt;= 50%, e-value &lt;= 1e-5). High-quality hits cluster in the upper-right quadrant. Right panel: Top 10 reactions by number of high-confidence BLAST hits, showing that branched-chain amino acid biosynthesis (rxn02185, rxn03436) and polyamine metabolism (rxn15947) dominate.</w:t>
       </w:r>
     </w:p>
     <w:p>
@@ -2786,14 +3062,30 @@
         <w:t xml:space="preserve">Other frequently resolved reactions include rxn15947 (carboxyspermidine decarboxylase, polyamine metabolism), rxn25279 (2-methylaconitate isomerase), and rxn14178 (pyruvate:ferredoxin oxidoreductase), all of which encode well-characterized enzymes with broad phylogenetic distribution in bacteria.</w:t>
       </w:r>
     </w:p>
-    <w:bookmarkEnd w:id="38"/>
-    <w:bookmarkStart w:id="39" w:name="dark-reactions-resist-resolution"/>
+    <w:p>
+      <w:pPr>
+        <w:pStyle w:val="BodyText"/>
+      </w:pPr>
+      <w:r>
+        <w:t xml:space="preserve">The 154 BLAST hits mapping to gapfilled reactions showed a bimodal quality distribution (Figure 4). High-quality hits (123 hits) were concentrated in well-characterized enzyme families with broad phylogenetic distribution: branched-chain amino acid biosynthesis (EC 2.2.1.6, EC 1.1.1.86), polyamine metabolism (EC 4.1.1.-), and central carbon metabolism (EC 1.2.7.1). Medium-quality hits (31 hits) tended to represent more divergent homologs, often to enzyme families with known sequence variability.</w:t>
+      </w:r>
+    </w:p>
+    <w:p>
+      <w:pPr>
+        <w:pStyle w:val="BodyText"/>
+      </w:pPr>
+      <w:r>
+        <w:t xml:space="preserve">The BLAST-only resolution rate (34.8%) establishes a floor for what sequence homology alone can achieve. The 13-percentage-point improvement from evidence integration (to 47.8%) demonstrates that fitness data and pangenome conservation provide complementary information that cannot be captured by sequence similarity searches alone.</w:t>
+      </w:r>
+    </w:p>
+    <w:bookmarkEnd w:id="50"/>
+    <w:bookmarkStart w:id="54" w:name="gapmind-concordance"/>
     <w:p>
       <w:pPr>
         <w:pStyle w:val="Heading3"/>
       </w:pPr>
       <w:r>
-        <w:t xml:space="preserve">3.5 Dark Reactions Resist Resolution</w:t>
+        <w:t xml:space="preserve">3.5 GapMind Concordance</w:t>
       </w:r>
     </w:p>
     <w:p>
@@ -2801,6 +3093,97 @@
         <w:pStyle w:val="FirstParagraph"/>
       </w:pPr>
       <w:r>
+        <w:t xml:space="preserve">GapMind pathway predictions [11] showed partial concordance with gapfilling results (Figure 5). Of 104 GapMind-pathway pairings (31 gapfilled cases mapped to GapMind pathways across multiple organisms), GapMind identified pathways as incomplete for many of the same carbon sources where ModelSEED required gapfilling. However, quantitative concordance was limited by GapMind’s pathway-level granularity: it reports step counts (nHi, nMed, nLo) but individual step identities are not available in the BERDL-hosted table, preventing direct matching of specific missing steps to specific gapfilled reactions.</w:t>
+      </w:r>
+    </w:p>
+    <w:p>
+      <w:pPr>
+        <w:pStyle w:val="CaptionedFigure"/>
+      </w:pPr>
+      <w:r>
+        <w:drawing>
+          <wp:inline>
+            <wp:extent cx="5334000" cy="2199079"/>
+            <wp:effectExtent b="0" l="0" r="0" t="0"/>
+            <wp:docPr descr="Figure 5. GapMind concordance with gapfilling. Left panel: Distribution of GapMind score categories across focal genomes for carbon source pathways, showing the proportion of pathways classified as complete, likely complete, steps missing (low/medium), or not present. Right panel: Concordance between GapMind pathway incompleteness and ModelSEED gapfilling requirements, with each point representing a carbon source-organism pairing." title="" id="52" name="Picture"/>
+            <a:graphic>
+              <a:graphicData uri="http://schemas.openxmlformats.org/drawingml/2006/picture">
+                <pic:pic>
+                  <pic:nvPicPr>
+                    <pic:cNvPr descr="figures/fig5_gapmind_concordance.png" id="53" name="Picture"/>
+                    <pic:cNvPicPr>
+                      <a:picLocks noChangeArrowheads="1" noChangeAspect="1"/>
+                    </pic:cNvPicPr>
+                  </pic:nvPicPr>
+                  <pic:blipFill>
+                    <a:blip r:embed="rId51"/>
+                    <a:stretch>
+                      <a:fillRect/>
+                    </a:stretch>
+                  </pic:blipFill>
+                  <pic:spPr bwMode="auto">
+                    <a:xfrm>
+                      <a:off x="0" y="0"/>
+                      <a:ext cx="5334000" cy="2199079"/>
+                    </a:xfrm>
+                    <a:prstGeom prst="rect">
+                      <a:avLst/>
+                    </a:prstGeom>
+                    <a:noFill/>
+                    <a:ln w="9525">
+                      <a:noFill/>
+                      <a:headEnd/>
+                      <a:tailEnd/>
+                    </a:ln>
+                  </pic:spPr>
+                </pic:pic>
+              </a:graphicData>
+            </a:graphic>
+          </wp:inline>
+        </w:drawing>
+      </w:r>
+    </w:p>
+    <w:p>
+      <w:pPr>
+        <w:pStyle w:val="ImageCaption"/>
+      </w:pPr>
+      <w:r>
+        <w:rPr>
+          <w:bCs/>
+          <w:b/>
+        </w:rPr>
+        <w:t xml:space="preserve">Figure 5. GapMind concordance with gapfilling.</w:t>
+      </w:r>
+      <w:r>
+        <w:t xml:space="preserve"> </w:t>
+      </w:r>
+      <w:r>
+        <w:t xml:space="preserve">Left panel: Distribution of GapMind score categories across focal genomes for carbon source pathways, showing the proportion of pathways classified as complete, likely complete, steps missing (low/medium), or not present. Right panel: Concordance between GapMind pathway incompleteness and ModelSEED gapfilling requirements, with each point representing a carbon source-organism pairing.</w:t>
+      </w:r>
+    </w:p>
+    <w:p>
+      <w:pPr>
+        <w:pStyle w:val="BodyText"/>
+      </w:pPr>
+      <w:r>
+        <w:t xml:space="preserve">Clade-level GapMind analysis (168 clade-pathway combinations) revealed that some pathways are universally incomplete across a species clade (suggesting genuine annotation gaps shared at the clade level), while others are incomplete only in the focal genome (suggesting strain-specific deletions or annotation errors).</w:t>
+      </w:r>
+    </w:p>
+    <w:bookmarkEnd w:id="54"/>
+    <w:bookmarkStart w:id="58" w:name="dark-reactions-resist-resolution"/>
+    <w:p>
+      <w:pPr>
+        <w:pStyle w:val="Heading3"/>
+      </w:pPr>
+      <w:r>
+        <w:t xml:space="preserve">3.6 Dark Reactions Resist Resolution</w:t>
+      </w:r>
+    </w:p>
+    <w:p>
+      <w:pPr>
+        <w:pStyle w:val="FirstParagraph"/>
+      </w:pPr>
+      <w:r>
         <w:t xml:space="preserve">Of the 201 gapfilled reactions, 50 (24.9%) had no EC number assigned by ModelSEED — so-called</w:t>
       </w:r>
       <w:r>
@@ -2824,72 +3207,85 @@
     </w:p>
     <w:p>
       <w:pPr>
+        <w:pStyle w:val="CaptionedFigure"/>
+      </w:pPr>
+      <w:r>
+        <w:drawing>
+          <wp:inline>
+            <wp:extent cx="5334000" cy="3313477"/>
+            <wp:effectExtent b="0" l="0" r="0" t="0"/>
+            <wp:docPr descr="Figure 6. EC conservation and dark reaction analysis. Histogram showing the distribution of EC number conservation across the 14 organisms. EC numbers present in many organisms (high conservation) tend to be well-resolved, while dark reactions (no EC number, shown separately) have a resolution rate of only 16% compared to 58.3% for EC-annotated reactions. This 3.6-fold difference highlights that dark reactions represent the frontier of metabolic annotation." title="" id="56" name="Picture"/>
+            <a:graphic>
+              <a:graphicData uri="http://schemas.openxmlformats.org/drawingml/2006/picture">
+                <pic:pic>
+                  <pic:nvPicPr>
+                    <pic:cNvPr descr="figures/fig6_conservation.png" id="57" name="Picture"/>
+                    <pic:cNvPicPr>
+                      <a:picLocks noChangeArrowheads="1" noChangeAspect="1"/>
+                    </pic:cNvPicPr>
+                  </pic:nvPicPr>
+                  <pic:blipFill>
+                    <a:blip r:embed="rId55"/>
+                    <a:stretch>
+                      <a:fillRect/>
+                    </a:stretch>
+                  </pic:blipFill>
+                  <pic:spPr bwMode="auto">
+                    <a:xfrm>
+                      <a:off x="0" y="0"/>
+                      <a:ext cx="5334000" cy="3313477"/>
+                    </a:xfrm>
+                    <a:prstGeom prst="rect">
+                      <a:avLst/>
+                    </a:prstGeom>
+                    <a:noFill/>
+                    <a:ln w="9525">
+                      <a:noFill/>
+                      <a:headEnd/>
+                      <a:tailEnd/>
+                    </a:ln>
+                  </pic:spPr>
+                </pic:pic>
+              </a:graphicData>
+            </a:graphic>
+          </wp:inline>
+        </w:drawing>
+      </w:r>
+    </w:p>
+    <w:p>
+      <w:pPr>
+        <w:pStyle w:val="ImageCaption"/>
+      </w:pPr>
+      <w:r>
+        <w:rPr>
+          <w:bCs/>
+          <w:b/>
+        </w:rPr>
+        <w:t xml:space="preserve">Figure 6. EC conservation and dark reaction analysis.</w:t>
+      </w:r>
+      <w:r>
+        <w:t xml:space="preserve"> </w:t>
+      </w:r>
+      <w:r>
+        <w:t xml:space="preserve">Histogram showing the distribution of EC number conservation across the 14 organisms. EC numbers present in many organisms (high conservation) tend to be well-resolved, while dark reactions (no EC number, shown separately) have a resolution rate of only 16% compared to 58.3% for EC-annotated reactions. This 3.6-fold difference highlights that dark reactions represent the frontier of metabolic annotation.</w:t>
+      </w:r>
+    </w:p>
+    <w:p>
+      <w:pPr>
         <w:pStyle w:val="BodyText"/>
       </w:pPr>
       <w:r>
         <w:t xml:space="preserve">Dark reactions include NCAIR synthetase/mutase (rxn05229), thiazole phosphate synthesis (rxn09310), biotin synthase (rxn00796), and several unannotated transport reactions. These represent the frontier of metabolic annotation — functions known to exist from stoichiometric modeling but not yet associated with characterized enzyme families.</w:t>
       </w:r>
     </w:p>
-    <w:bookmarkEnd w:id="39"/>
-    <w:bookmarkStart w:id="40" w:name="gapmind-concordance"/>
+    <w:bookmarkEnd w:id="58"/>
+    <w:bookmarkStart w:id="59" w:name="threshold-sensitivity-analysis"/>
     <w:p>
       <w:pPr>
         <w:pStyle w:val="Heading3"/>
       </w:pPr>
       <w:r>
-        <w:t xml:space="preserve">3.6 GapMind Concordance</w:t>
-      </w:r>
-    </w:p>
-    <w:p>
-      <w:pPr>
-        <w:pStyle w:val="FirstParagraph"/>
-      </w:pPr>
-      <w:r>
-        <w:t xml:space="preserve">GapMind pathway predictions showed partial concordance with gapfilling results (Figure 5). Of 104 GapMind-pathway pairings (31 gapfilled cases mapped to GapMind pathways across multiple organisms), GapMind identified pathways as incomplete for many of the same carbon sources where ModelSEED required gapfilling. However, quantitative concordance was limited by GapMind’s pathway-level granularity: it reports step counts (nHi, nMed, nLo) but individual step identities are not available in the BERDL-hosted table, preventing direct matching of specific missing steps to specific gapfilled reactions.</w:t>
-      </w:r>
-    </w:p>
-    <w:p>
-      <w:pPr>
-        <w:pStyle w:val="BodyText"/>
-      </w:pPr>
-      <w:r>
-        <w:t xml:space="preserve">Clade-level GapMind analysis (168 clade-pathway combinations) revealed that some pathways are universally incomplete across a species clade (suggesting genuine annotation gaps shared at the clade level), while others are incomplete only in the focal genome (suggesting strain-specific deletions or annotation errors).</w:t>
-      </w:r>
-    </w:p>
-    <w:bookmarkEnd w:id="40"/>
-    <w:bookmarkStart w:id="41" w:name="blast-hit-quality"/>
-    <w:p>
-      <w:pPr>
-        <w:pStyle w:val="Heading3"/>
-      </w:pPr>
-      <w:r>
-        <w:t xml:space="preserve">3.7 BLAST Hit Quality</w:t>
-      </w:r>
-    </w:p>
-    <w:p>
-      <w:pPr>
-        <w:pStyle w:val="FirstParagraph"/>
-      </w:pPr>
-      <w:r>
-        <w:t xml:space="preserve">The 154 BLAST hits mapping to gapfilled reactions showed a bimodal quality distribution (Figure 4). High-quality hits (123 hits meeting identity &gt;= 30%, coverage &gt;= 70%, e-value &lt;= 1e-10) were concentrated in well-characterized enzyme families with broad phylogenetic distribution: branched-chain amino acid biosynthesis (EC 2.2.1.6, EC 1.1.1.86), polyamine metabolism (EC 4.1.1.-), and central carbon metabolism (EC 1.2.7.1). Medium-quality hits (31 hits) tended to represent more divergent homologs, often to enzyme families with known sequence variability.</w:t>
-      </w:r>
-    </w:p>
-    <w:p>
-      <w:pPr>
-        <w:pStyle w:val="BodyText"/>
-      </w:pPr>
-      <w:r>
-        <w:t xml:space="preserve">The BLAST-only resolution rate (34.8%) establishes a floor for what sequence homology alone can achieve. The 13-percentage-point improvement from evidence integration (to 47.8%) demonstrates that fitness data and pangenome conservation provide complementary information that cannot be captured by sequence similarity searches alone.</w:t>
-      </w:r>
-    </w:p>
-    <w:bookmarkEnd w:id="41"/>
-    <w:bookmarkStart w:id="42" w:name="threshold-sensitivity-analysis"/>
-    <w:p>
-      <w:pPr>
-        <w:pStyle w:val="Heading3"/>
-      </w:pPr>
-      <w:r>
-        <w:t xml:space="preserve">3.8 Threshold Sensitivity Analysis</w:t>
+        <w:t xml:space="preserve">3.7 Threshold Sensitivity Analysis</w:t>
       </w:r>
     </w:p>
     <w:p>
@@ -2923,9 +3319,9 @@
         </w:pict>
       </w:r>
     </w:p>
-    <w:bookmarkEnd w:id="42"/>
-    <w:bookmarkEnd w:id="43"/>
-    <w:bookmarkStart w:id="49" w:name="discussion"/>
+    <w:bookmarkEnd w:id="59"/>
+    <w:bookmarkEnd w:id="60"/>
+    <w:bookmarkStart w:id="66" w:name="discussion"/>
     <w:p>
       <w:pPr>
         <w:pStyle w:val="Heading2"/>
@@ -2934,7 +3330,7 @@
         <w:t xml:space="preserve">4. Discussion</w:t>
       </w:r>
     </w:p>
-    <w:bookmarkStart w:id="44" w:name="Xe96543755cee9defd4a1fedb63e0c6f80de14b2"/>
+    <w:bookmarkStart w:id="61" w:name="Xe96543755cee9defd4a1fedb63e0c6f80de14b2"/>
     <w:p>
       <w:pPr>
         <w:pStyle w:val="Heading3"/>
@@ -2959,8 +3355,8 @@
         <w:t xml:space="preserve">The complementarity of evidence streams is particularly notable. BLAST identifies homologs for well-characterized enzyme families but fails for divergent sequences and dark reactions. Fitness data provides condition-specific gene importance but cannot distinguish between direct enzymatic roles and indirect regulatory effects. Pangenome conservation identifies genes expected to be present based on clade-level patterns but cannot assign specific functions. The triangulation of these orthogonal evidence types yields confidence that exceeds what any individual approach provides.</w:t>
       </w:r>
     </w:p>
-    <w:bookmarkEnd w:id="44"/>
-    <w:bookmarkStart w:id="45" w:name="comparison-to-prior-work"/>
+    <w:bookmarkEnd w:id="61"/>
+    <w:bookmarkStart w:id="62" w:name="comparison-to-prior-work"/>
     <w:p>
       <w:pPr>
         <w:pStyle w:val="Heading3"/>
@@ -2974,31 +3370,31 @@
         <w:pStyle w:val="FirstParagraph"/>
       </w:pPr>
       <w:r>
-        <w:t xml:space="preserve">Our approach extends several prior efforts in fitness-guided gene annotation. Price et al. (2022) used Fitness Browser data to fill gaps in bacterial catabolic pathways, annotating 716 proteins across diverse bacteria. Our study differs by systematically integrating fitness evidence with gapfilling predictions from metabolic models, providing a model-centric rather than pathway-centric framework. This enables the identification of annotation gaps that are specific to individual organisms and growth conditions, rather than relying on predefined pathway definitions.</w:t>
-      </w:r>
-    </w:p>
-    <w:p>
-      <w:pPr>
-        <w:pStyle w:val="BodyText"/>
-      </w:pPr>
-      <w:r>
-        <w:t xml:space="preserve">Benedict et al. (2014) developed likelihood-based gene annotations for gap filling using sequence homology, demonstrating that probabilistic approaches improve metabolic model quality. Our confidence scoring framework similarly weights multiple evidence types, but extends beyond sequence homology by incorporating fitness and pangenome data that Benedict et al. did not consider.</w:t>
-      </w:r>
-    </w:p>
-    <w:p>
-      <w:pPr>
-        <w:pStyle w:val="BodyText"/>
-      </w:pPr>
-      <w:r>
-        <w:t xml:space="preserve">The gapseq tool (Zimmermann et al., 2021) represents the closest methodological comparator. Gapseq uses curated pathway databases and informed gap-filling to build metabolic models with reduced gapfill burden. However, gapseq focuses on improving initial model reconstruction rather than resolving remaining annotation gaps post-hoc. Our pipeline is complementary: gapseq could reduce the number of gapfilled reactions requiring investigation (our Future Direction 3), while our triangulation approach resolves the remaining gaps.</w:t>
-      </w:r>
-    </w:p>
-    <w:p>
-      <w:pPr>
-        <w:pStyle w:val="BodyText"/>
-      </w:pPr>
-      <w:r>
-        <w:t xml:space="preserve">Borchert et al. (2024) applied independent component analysis to RB-TnSeq fitness data from</w:t>
+        <w:t xml:space="preserve">Our approach extends several prior efforts in fitness-guided gene annotation. Price et al. [18] used Fitness Browser data to fill gaps in bacterial catabolic pathways, annotating 716 proteins across diverse bacteria. Our study differs by systematically integrating fitness evidence with gapfilling predictions from metabolic models, providing a model-centric rather than pathway-centric framework. This enables the identification of annotation gaps that are specific to individual organisms and growth conditions, rather than relying on predefined pathway definitions.</w:t>
+      </w:r>
+    </w:p>
+    <w:p>
+      <w:pPr>
+        <w:pStyle w:val="BodyText"/>
+      </w:pPr>
+      <w:r>
+        <w:t xml:space="preserve">Benedict et al. [12] developed likelihood-based gene annotations for gap filling using sequence homology, demonstrating that probabilistic approaches improve metabolic model quality. Our confidence scoring framework similarly weights multiple evidence types, but extends beyond sequence homology by incorporating fitness and pangenome data that Benedict et al. did not consider.</w:t>
+      </w:r>
+    </w:p>
+    <w:p>
+      <w:pPr>
+        <w:pStyle w:val="BodyText"/>
+      </w:pPr>
+      <w:r>
+        <w:t xml:space="preserve">The gapseq tool [13] represents the closest methodological comparator. Gapseq uses curated pathway databases and informed gap-filling to build metabolic models with reduced gapfill burden. However, gapseq focuses on improving initial model reconstruction rather than resolving remaining annotation gaps post-hoc. Our pipeline is complementary: gapseq could reduce the number of gapfilled reactions requiring investigation, while our triangulation approach resolves the remaining gaps.</w:t>
+      </w:r>
+    </w:p>
+    <w:p>
+      <w:pPr>
+        <w:pStyle w:val="BodyText"/>
+      </w:pPr>
+      <w:r>
+        <w:t xml:space="preserve">Borchert et al. [14] applied independent component analysis to RB-TnSeq fitness data from</w:t>
       </w:r>
       <w:r>
         <w:t xml:space="preserve"> </w:t>
@@ -3011,11 +3407,11 @@
         <w:t xml:space="preserve">Pseudomonas putida</w:t>
       </w:r>
       <w:r>
-        <w:t xml:space="preserve">, identifying 84 functional gene modules. Their machine-learning approach to fitness data complements our per-gene, per-condition analysis and represents a promising avenue for extending our pipeline (our Future Direction 6).</w:t>
-      </w:r>
-    </w:p>
-    <w:bookmarkEnd w:id="45"/>
-    <w:bookmarkStart w:id="46" w:name="phylogenetic-bias-and-generalizability"/>
+        <w:t xml:space="preserve">, identifying 84 functional gene modules. Their machine-learning approach to fitness data complements our per-gene, per-condition analysis and represents a promising avenue for extending our pipeline.</w:t>
+      </w:r>
+    </w:p>
+    <w:bookmarkEnd w:id="62"/>
+    <w:bookmarkStart w:id="63" w:name="phylogenetic-bias-and-generalizability"/>
     <w:p>
       <w:pPr>
         <w:pStyle w:val="Heading3"/>
@@ -3066,8 +3462,8 @@
         <w:t xml:space="preserve">resolution.</w:t>
       </w:r>
     </w:p>
-    <w:bookmarkEnd w:id="46"/>
-    <w:bookmarkStart w:id="47" w:name="dark-reactions-as-an-annotation-frontier"/>
+    <w:bookmarkEnd w:id="63"/>
+    <w:bookmarkStart w:id="64" w:name="dark-reactions-as-an-annotation-frontier"/>
     <w:p>
       <w:pPr>
         <w:pStyle w:val="Heading3"/>
@@ -3105,11 +3501,11 @@
         <w:t xml:space="preserve"> </w:t>
       </w:r>
       <w:r>
-        <w:t xml:space="preserve">enzyme function prediction from protein structure and sequence — such as DeepEC (Ryu et al., 2019), CLEAN (Yu et al., 2023), and structure-based approaches leveraging AlphaFold2 predictions — could address this frontier. Integrating such predictions as an additional evidence stream in our triangulation framework is a promising extension.</w:t>
-      </w:r>
-    </w:p>
-    <w:bookmarkEnd w:id="47"/>
-    <w:bookmarkStart w:id="48" w:name="limitations"/>
+        <w:t xml:space="preserve">enzyme function prediction from protein structure and sequence — such as DeepEC [19], CLEAN [20], and structure-based approaches leveraging AlphaFold2 predictions — could address this frontier. Integrating such predictions as an additional evidence stream in our triangulation framework is a promising extension.</w:t>
+      </w:r>
+    </w:p>
+    <w:bookmarkEnd w:id="64"/>
+    <w:bookmarkStart w:id="65" w:name="limitations"/>
     <w:p>
       <w:pPr>
         <w:pStyle w:val="Heading3"/>
@@ -3141,7 +3537,7 @@
         <w:t xml:space="preserve">Model quality</w:t>
       </w:r>
       <w:r>
-        <w:t xml:space="preserve">: Draft models built from automated RAST annotations have limited precision (42.5%), dominated by false-positive growth predictions. This inflates the denominator of growth-positive conditions and may cause some true-negative cases to be misclassified as false negatives requiring gapfilling.</w:t>
+        <w:t xml:space="preserve">: Draft models built from automated RAST annotations [3] have limited precision (42.5%), dominated by false-positive growth predictions. This inflates the denominator of growth-positive conditions and may cause some true-negative cases to be misclassified as false negatives requiring gapfilling.</w:t>
       </w:r>
     </w:p>
     <w:p>
@@ -3159,7 +3555,7 @@
         <w:t xml:space="preserve">Gapfilling non-uniqueness</w:t>
       </w:r>
       <w:r>
-        <w:t xml:space="preserve">: ModelSEED gapfilling minimizes the number of added reactions but does not guarantee biological optimality. Alternative gapfill solutions may exist that require different reaction sets, potentially leading to different annotation gap identities.</w:t>
+        <w:t xml:space="preserve">: ModelSEED gapfilling [1] minimizes the number of added reactions but does not guarantee biological optimality. Alternative gapfill solutions may exist that require different reaction sets, potentially leading to different annotation gap identities.</w:t>
       </w:r>
     </w:p>
     <w:p>
@@ -3213,7 +3609,7 @@
         <w:t xml:space="preserve">Fitness threshold sensitivity</w:t>
       </w:r>
       <w:r>
-        <w:t xml:space="preserve">: While our threshold sensitivity analysis demonstrates robustness of the overall resolution rate, the confidence tier assignments for individual pairs can shift with threshold choice. The fitness threshold primarily affects whether a pair is classified as high versus medium/low confidence, not whether it is resolved at all.</w:t>
+        <w:t xml:space="preserve">: While our threshold sensitivity analysis demonstrates robustness of the overall resolution rate (Supplementary Figure S1), the confidence tier assignments for individual pairs can shift with threshold choice. The fitness threshold primarily affects whether a pair is classified as high versus medium/low confidence, not whether it is resolved at all.</w:t>
       </w:r>
     </w:p>
     <w:p>
@@ -3231,7 +3627,7 @@
         <w:t xml:space="preserve">GapMind scope</w:t>
       </w:r>
       <w:r>
-        <w:t xml:space="preserve">: GapMind covers approximately 80 carbon and amino acid utilization pathways, not full metabolism. Many gapfilled reactions fall outside GapMind’s pathway coverage, limiting its contribution as an independent evidence stream.</w:t>
+        <w:t xml:space="preserve">: GapMind [11] covers approximately 80 carbon and amino acid utilization pathways, not full metabolism. Many gapfilled reactions fall outside GapMind’s pathway coverage, limiting its contribution as an independent evidence stream.</w:t>
       </w:r>
     </w:p>
     <w:p>
@@ -3293,9 +3689,9 @@
         </w:pict>
       </w:r>
     </w:p>
-    <w:bookmarkEnd w:id="48"/>
-    <w:bookmarkEnd w:id="49"/>
-    <w:bookmarkStart w:id="50" w:name="conclusions"/>
+    <w:bookmarkEnd w:id="65"/>
+    <w:bookmarkEnd w:id="66"/>
+    <w:bookmarkStart w:id="67" w:name="conclusions"/>
     <w:p>
       <w:pPr>
         <w:pStyle w:val="Heading2"/>
@@ -3309,15 +3705,15 @@
         <w:pStyle w:val="FirstParagraph"/>
       </w:pPr>
       <w:r>
-        <w:t xml:space="preserve">We have demonstrated that systematic integration of five evidence types — metabolic model gapfilling, GapMind pathway predictions, RB-TnSeq fitness data, pangenome gene cluster conservation, and DIAMOND BLAST sequence homology — resolves 47.8% of annotation gaps in bacterial metabolic models, significantly exceeding the 30% pre-specified hypothesis threshold. This result is robust across 240 threshold parameter combinations (range: 42.8%–47.8%) and is supported by leave-one-out cross-validation showing unique contributions from each evidence stream.</w:t>
-      </w:r>
-    </w:p>
-    <w:p>
-      <w:pPr>
-        <w:pStyle w:val="BodyText"/>
-      </w:pPr>
-      <w:r>
-        <w:t xml:space="preserve">The 44 high-confidence gene-reaction assignments represent directly testable hypotheses for experimental validation, with the branched-chain amino acid biosynthesis pathway (rxn02185, rxn03436) providing particularly strong multi-organism targets. The 105 unresolved pairs — including 50 dark reactions — define the current frontier of metabolic annotation and represent high-priority targets for experimental enzyme characterization and computational enzyme function prediction.</w:t>
+        <w:t xml:space="preserve">We have demonstrated that systematic integration of five evidence types — metabolic model gapfilling [1], GapMind pathway predictions [11], RB-TnSeq fitness data [9, 10], pangenome gene cluster conservation, and DIAMOND BLAST sequence homology [16] — resolves 47.8% of annotation gaps in bacterial metabolic models, significantly exceeding the 30% pre-specified hypothesis threshold. This result is robust across 240 threshold parameter combinations (range: 42.8%–47.8%) and is supported by leave-one-out cross-validation showing unique contributions from each evidence stream.</w:t>
+      </w:r>
+    </w:p>
+    <w:p>
+      <w:pPr>
+        <w:pStyle w:val="BodyText"/>
+      </w:pPr>
+      <w:r>
+        <w:t xml:space="preserve">The 44 high-confidence gene-reaction assignments represent directly testable hypotheses for experimental validation, with the branched-chain amino acid biosynthesis pathway (rxn02185, rxn03436) providing particularly strong multi-organism targets. The 105 unresolved pairs — including 50 dark reactions — define the current frontier of metabolic annotation and represent high-priority targets for experimental enzyme characterization and computational enzyme function prediction [19, 20].</w:t>
       </w:r>
     </w:p>
     <w:p>
@@ -3335,8 +3731,8 @@
         </w:pict>
       </w:r>
     </w:p>
-    <w:bookmarkEnd w:id="50"/>
-    <w:bookmarkStart w:id="51" w:name="data-availability"/>
+    <w:bookmarkEnd w:id="67"/>
+    <w:bookmarkStart w:id="68" w:name="data-availability"/>
     <w:p>
       <w:pPr>
         <w:pStyle w:val="Heading2"/>
@@ -3362,7 +3758,7 @@
         <w:t xml:space="preserve">projects/annotation_gap_discovery/</w:t>
       </w:r>
       <w:r>
-        <w:t xml:space="preserve">. Notebooks are committed with saved outputs for reproducibility without re-execution. The pipeline requires BERDL Spark access for NB01–NB05 and DIAMOND for NB06; NB07–NB08 and the supplementary notebook run locally with standard Python packages.</w:t>
+        <w:t xml:space="preserve">. Notebooks are committed with saved outputs for reproducibility without re-execution. The pipeline requires BERDL Spark access for NB01–NB05 and DIAMOND [16] for NB06; NB07–NB08 and the supplementary notebook run locally with standard Python packages.</w:t>
       </w:r>
     </w:p>
     <w:p>
@@ -3372,15 +3768,15 @@
       <w:r>
         <w:t xml:space="preserve">Key datasets:</w:t>
       </w:r>
-      <w:r>
-        <w:t xml:space="preserve"> </w:t>
-      </w:r>
-      <w:r>
-        <w:t xml:space="preserve">-</w:t>
-      </w:r>
-      <w:r>
-        <w:t xml:space="preserve"> </w:t>
-      </w:r>
+    </w:p>
+    <w:p>
+      <w:pPr>
+        <w:numPr>
+          <w:ilvl w:val="0"/>
+          <w:numId w:val="1003"/>
+        </w:numPr>
+        <w:pStyle w:val="Compact"/>
+      </w:pPr>
       <w:r>
         <w:rPr>
           <w:rStyle w:val="VerbatimChar"/>
@@ -3393,15 +3789,15 @@
       <w:r>
         <w:t xml:space="preserve">— Master table: 201 reaction-organism pairs with all evidence columns and confidence scores</w:t>
       </w:r>
-      <w:r>
-        <w:t xml:space="preserve"> </w:t>
-      </w:r>
-      <w:r>
-        <w:t xml:space="preserve">-</w:t>
-      </w:r>
-      <w:r>
-        <w:t xml:space="preserve"> </w:t>
-      </w:r>
+    </w:p>
+    <w:p>
+      <w:pPr>
+        <w:numPr>
+          <w:ilvl w:val="0"/>
+          <w:numId w:val="1003"/>
+        </w:numPr>
+        <w:pStyle w:val="Compact"/>
+      </w:pPr>
       <w:r>
         <w:rPr>
           <w:rStyle w:val="VerbatimChar"/>
@@ -3414,15 +3810,15 @@
       <w:r>
         <w:t xml:space="preserve">— 154 DIAMOND BLAST hits against Swiss-Prot exemplar sequences</w:t>
       </w:r>
-      <w:r>
-        <w:t xml:space="preserve"> </w:t>
-      </w:r>
-      <w:r>
-        <w:t xml:space="preserve">-</w:t>
-      </w:r>
-      <w:r>
-        <w:t xml:space="preserve"> </w:t>
-      </w:r>
+    </w:p>
+    <w:p>
+      <w:pPr>
+        <w:numPr>
+          <w:ilvl w:val="0"/>
+          <w:numId w:val="1003"/>
+        </w:numPr>
+        <w:pStyle w:val="Compact"/>
+      </w:pPr>
       <w:r>
         <w:rPr>
           <w:rStyle w:val="VerbatimChar"/>
@@ -3443,8 +3839,8 @@
         </w:pict>
       </w:r>
     </w:p>
-    <w:bookmarkEnd w:id="51"/>
-    <w:bookmarkStart w:id="52" w:name="acknowledgments"/>
+    <w:bookmarkEnd w:id="68"/>
+    <w:bookmarkStart w:id="69" w:name="acknowledgments"/>
     <w:p>
       <w:pPr>
         <w:pStyle w:val="Heading2"/>
@@ -3458,7 +3854,7 @@
         <w:pStyle w:val="FirstParagraph"/>
       </w:pPr>
       <w:r>
-        <w:t xml:space="preserve">This work used resources of the KBase BER Data Lakehouse (BERDL) and the Fitness Browser maintained by Adam Deutschbauer, Morgan Price, and Adam Arkin at Lawrence Berkeley National Laboratory. Pangenome data was derived from GTDB-based species pangenomes constructed by the KBase team. ModelSEED biochemistry data was provided by the ModelSEED project.</w:t>
+        <w:t xml:space="preserve">This work used resources of the KBase BER Data Lakehouse (BERDL) [15] and the Fitness Browser maintained by Adam Deutschbauer, Morgan Price, and Adam Arkin at Lawrence Berkeley National Laboratory [9, 10]. Pangenome data was derived from GTDB-based species pangenomes constructed by the KBase team. ModelSEED biochemistry data was provided by the ModelSEED project [1].</w:t>
       </w:r>
     </w:p>
     <w:p>
@@ -3468,8 +3864,8 @@
         </w:pict>
       </w:r>
     </w:p>
-    <w:bookmarkEnd w:id="52"/>
-    <w:bookmarkStart w:id="53" w:name="references"/>
+    <w:bookmarkEnd w:id="69"/>
+    <w:bookmarkStart w:id="70" w:name="references"/>
     <w:p>
       <w:pPr>
         <w:pStyle w:val="Heading2"/>
@@ -3483,7 +3879,7 @@
         <w:pStyle w:val="FirstParagraph"/>
       </w:pPr>
       <w:r>
-        <w:t xml:space="preserve">Arkin AP, Cottingham RW, Henry CS, et al. (2018). KBase: The United States Department of Energy Systems Biology Knowledgebase.</w:t>
+        <w:t xml:space="preserve">[1] Henry CS, DeJongh M, Best AA, Frybarger PM, Linsay B, Stevens RL. High-throughput generation, optimization and analysis of genome-scale metabolic models.</w:t>
       </w:r>
       <w:r>
         <w:t xml:space="preserve"> </w:t>
@@ -3496,15 +3892,15 @@
         <w:t xml:space="preserve">Nature Biotechnology</w:t>
       </w:r>
       <w:r>
-        <w:t xml:space="preserve">, 36(7):566–569. PMID: 29979655.</w:t>
-      </w:r>
-    </w:p>
-    <w:p>
-      <w:pPr>
-        <w:pStyle w:val="BodyText"/>
-      </w:pPr>
-      <w:r>
-        <w:t xml:space="preserve">Aziz RK, Bartels D, Best AA, et al. (2008). The RAST Server: Rapid Annotations using Subsystems Technology.</w:t>
+        <w:t xml:space="preserve">. 2010;28(9):977–982. doi:10.1038/nbt.1672. PMID: 20802497.</w:t>
+      </w:r>
+    </w:p>
+    <w:p>
+      <w:pPr>
+        <w:pStyle w:val="BodyText"/>
+      </w:pPr>
+      <w:r>
+        <w:t xml:space="preserve">[2] Thiele I, Palsson BO. A protocol for generating a high-quality genome-scale metabolic reconstruction.</w:t>
       </w:r>
       <w:r>
         <w:t xml:space="preserve"> </w:t>
@@ -3514,18 +3910,18 @@
           <w:iCs/>
           <w:i/>
         </w:rPr>
-        <w:t xml:space="preserve">BMC Genomics</w:t>
-      </w:r>
-      <w:r>
-        <w:t xml:space="preserve">, 9:75. PMID: 18261238.</w:t>
-      </w:r>
-    </w:p>
-    <w:p>
-      <w:pPr>
-        <w:pStyle w:val="BodyText"/>
-      </w:pPr>
-      <w:r>
-        <w:t xml:space="preserve">Benedict MN, Mundy MB, Henry CS, Ber A, Thiele I. (2014). Likelihood-based gene annotations for gap filling and quality assessment in genome-scale metabolic models.</w:t>
+        <w:t xml:space="preserve">Nature Protocols</w:t>
+      </w:r>
+      <w:r>
+        <w:t xml:space="preserve">. 2010;5(1):93–121. doi:10.1038/nprot.2009.203. PMID: 20057383.</w:t>
+      </w:r>
+    </w:p>
+    <w:p>
+      <w:pPr>
+        <w:pStyle w:val="BodyText"/>
+      </w:pPr>
+      <w:r>
+        <w:t xml:space="preserve">[3] Aziz RK, Bartels D, Best AA, et al. The RAST Server: Rapid Annotations using Subsystems Technology.</w:t>
       </w:r>
       <w:r>
         <w:t xml:space="preserve"> </w:t>
@@ -3535,18 +3931,18 @@
           <w:iCs/>
           <w:i/>
         </w:rPr>
-        <w:t xml:space="preserve">PLoS Computational Biology</w:t>
-      </w:r>
-      <w:r>
-        <w:t xml:space="preserve">, 10(10):e1003882. PMID: 25329157.</w:t>
-      </w:r>
-    </w:p>
-    <w:p>
-      <w:pPr>
-        <w:pStyle w:val="BodyText"/>
-      </w:pPr>
-      <w:r>
-        <w:t xml:space="preserve">Borchert AJ, Bleem AC, Lim HG, et al. (2024). Machine learning analysis of RB-TnSeq fitness data predicts functional gene modules in</w:t>
+        <w:t xml:space="preserve">BMC Genomics</w:t>
+      </w:r>
+      <w:r>
+        <w:t xml:space="preserve">. 2008;9:75. doi:10.1186/1471-2164-9-75. PMID: 18261238.</w:t>
+      </w:r>
+    </w:p>
+    <w:p>
+      <w:pPr>
+        <w:pStyle w:val="BodyText"/>
+      </w:pPr>
+      <w:r>
+        <w:t xml:space="preserve">[4] Seemann T. Prokka: rapid prokaryotic genome annotation.</w:t>
       </w:r>
       <w:r>
         <w:t xml:space="preserve"> </w:t>
@@ -3556,13 +3952,18 @@
           <w:iCs/>
           <w:i/>
         </w:rPr>
-        <w:t xml:space="preserve">Pseudomonas putida</w:t>
-      </w:r>
-      <w:r>
-        <w:t xml:space="preserve"> </w:t>
-      </w:r>
-      <w:r>
-        <w:t xml:space="preserve">KT2440.</w:t>
+        <w:t xml:space="preserve">Bioinformatics</w:t>
+      </w:r>
+      <w:r>
+        <w:t xml:space="preserve">. 2014;30(14):2068–2069. doi:10.1093/bioinformatics/btu153. PMID: 24642063.</w:t>
+      </w:r>
+    </w:p>
+    <w:p>
+      <w:pPr>
+        <w:pStyle w:val="BodyText"/>
+      </w:pPr>
+      <w:r>
+        <w:t xml:space="preserve">[5] Schwengers O, Jelonek L, Diber MA, Fees D, Usadel B, Goesmann A. Bakta: rapid and standardized annotation of bacterial genomes via a comprehensive and curated database.</w:t>
       </w:r>
       <w:r>
         <w:t xml:space="preserve"> </w:t>
@@ -3572,18 +3973,18 @@
           <w:iCs/>
           <w:i/>
         </w:rPr>
-        <w:t xml:space="preserve">mSystems</w:t>
-      </w:r>
-      <w:r>
-        <w:t xml:space="preserve">, 9(3):e00942-23. DOI: 10.1128/msystems.00942-23. PMID: 38323821.</w:t>
-      </w:r>
-    </w:p>
-    <w:p>
-      <w:pPr>
-        <w:pStyle w:val="BodyText"/>
-      </w:pPr>
-      <w:r>
-        <w:t xml:space="preserve">Buchfink B, Xie C, Huson DH. (2015). Fast and sensitive protein alignment using DIAMOND.</w:t>
+        <w:t xml:space="preserve">Microbial Genomics</w:t>
+      </w:r>
+      <w:r>
+        <w:t xml:space="preserve">. 2021;7(11):000685. doi:10.1099/mgen.0.000685. PMID: 34739369.</w:t>
+      </w:r>
+    </w:p>
+    <w:p>
+      <w:pPr>
+        <w:pStyle w:val="BodyText"/>
+      </w:pPr>
+      <w:r>
+        <w:t xml:space="preserve">[6] Orth JD, Palsson BO. Systematizing the generation of missing metabolic knowledge.</w:t>
       </w:r>
       <w:r>
         <w:t xml:space="preserve"> </w:t>
@@ -3593,18 +3994,18 @@
           <w:iCs/>
           <w:i/>
         </w:rPr>
-        <w:t xml:space="preserve">Nature Methods</w:t>
-      </w:r>
-      <w:r>
-        <w:t xml:space="preserve">, 12(1):59–60. PMID: 25402007.</w:t>
-      </w:r>
-    </w:p>
-    <w:p>
-      <w:pPr>
-        <w:pStyle w:val="BodyText"/>
-      </w:pPr>
-      <w:r>
-        <w:t xml:space="preserve">Deutschbauer A, Price MN, Wetmore KM, et al. (2011). Evidence-based annotation of gene function in</w:t>
+        <w:t xml:space="preserve">Biotechnology and Bioengineering</w:t>
+      </w:r>
+      <w:r>
+        <w:t xml:space="preserve">. 2010;107(3):403–412. doi:10.1002/bit.22844. PMID: 20589842.</w:t>
+      </w:r>
+    </w:p>
+    <w:p>
+      <w:pPr>
+        <w:pStyle w:val="BodyText"/>
+      </w:pPr>
+      <w:r>
+        <w:t xml:space="preserve">[7] Kumar VS, Dasika MS, Maranas CD. Optimization based automated curation of metabolic reconstructions.</w:t>
       </w:r>
       <w:r>
         <w:t xml:space="preserve"> </w:t>
@@ -3614,13 +4015,18 @@
           <w:iCs/>
           <w:i/>
         </w:rPr>
-        <w:t xml:space="preserve">Shewanella oneidensis</w:t>
-      </w:r>
-      <w:r>
-        <w:t xml:space="preserve"> </w:t>
-      </w:r>
-      <w:r>
-        <w:t xml:space="preserve">MR-1 using genome-wide fitness profiling across 121 conditions.</w:t>
+        <w:t xml:space="preserve">BMC Bioinformatics</w:t>
+      </w:r>
+      <w:r>
+        <w:t xml:space="preserve">. 2007;8:212. doi:10.1186/1471-2105-8-212. PMID: 17584497.</w:t>
+      </w:r>
+    </w:p>
+    <w:p>
+      <w:pPr>
+        <w:pStyle w:val="BodyText"/>
+      </w:pPr>
+      <w:r>
+        <w:t xml:space="preserve">[8] Omelchenko MV, Galperin MY, Wolf YI, Koonin EV. Non-homologous isofunctional enzymes: a systematic analysis of alternative solutions in enzyme evolution.</w:t>
       </w:r>
       <w:r>
         <w:t xml:space="preserve"> </w:t>
@@ -3630,18 +4036,18 @@
           <w:iCs/>
           <w:i/>
         </w:rPr>
-        <w:t xml:space="preserve">PLoS Genetics</w:t>
-      </w:r>
-      <w:r>
-        <w:t xml:space="preserve">, 7(11):e1002385. PMID: 22125499.</w:t>
-      </w:r>
-    </w:p>
-    <w:p>
-      <w:pPr>
-        <w:pStyle w:val="BodyText"/>
-      </w:pPr>
-      <w:r>
-        <w:t xml:space="preserve">Ebrahim A, Lerman JA, Palsson BO, Hyduke DR. (2013). COBRApy: COnstraints-Based Reconstruction and Analysis for Python.</w:t>
+        <w:t xml:space="preserve">Biology Direct</w:t>
+      </w:r>
+      <w:r>
+        <w:t xml:space="preserve">. 2010;5:31. doi:10.1186/1745-6150-5-31. PMID: 20433725.</w:t>
+      </w:r>
+    </w:p>
+    <w:p>
+      <w:pPr>
+        <w:pStyle w:val="BodyText"/>
+      </w:pPr>
+      <w:r>
+        <w:t xml:space="preserve">[9] Wetmore KM, Price MN, Waters RJ, et al. Rapid quantification of mutant fitness in diverse bacteria by sequencing randomly bar-coded transposons.</w:t>
       </w:r>
       <w:r>
         <w:t xml:space="preserve"> </w:t>
@@ -3651,18 +4057,18 @@
           <w:iCs/>
           <w:i/>
         </w:rPr>
-        <w:t xml:space="preserve">BMC Systems Biology</w:t>
-      </w:r>
-      <w:r>
-        <w:t xml:space="preserve">, 7:74. PMID: 23927696.</w:t>
-      </w:r>
-    </w:p>
-    <w:p>
-      <w:pPr>
-        <w:pStyle w:val="BodyText"/>
-      </w:pPr>
-      <w:r>
-        <w:t xml:space="preserve">Henry CS, DeJongh M, Best AA, Frybarger PM, Linsay B, Stevens RL. (2010). High-throughput generation, optimization and analysis of genome-scale metabolic models.</w:t>
+        <w:t xml:space="preserve">mBio</w:t>
+      </w:r>
+      <w:r>
+        <w:t xml:space="preserve">. 2015;6(3):e00306-15. doi:10.1128/mBio.00306-15. PMID: 25968644.</w:t>
+      </w:r>
+    </w:p>
+    <w:p>
+      <w:pPr>
+        <w:pStyle w:val="BodyText"/>
+      </w:pPr>
+      <w:r>
+        <w:t xml:space="preserve">[10] Price MN, Wetmore KM, Waters RJ, et al. Mutant phenotypes for thousands of bacterial genes of unknown function.</w:t>
       </w:r>
       <w:r>
         <w:t xml:space="preserve"> </w:t>
@@ -3672,18 +4078,18 @@
           <w:iCs/>
           <w:i/>
         </w:rPr>
-        <w:t xml:space="preserve">Nature Biotechnology</w:t>
-      </w:r>
-      <w:r>
-        <w:t xml:space="preserve">, 28(9):977–982. PMID: 20802497.</w:t>
-      </w:r>
-    </w:p>
-    <w:p>
-      <w:pPr>
-        <w:pStyle w:val="BodyText"/>
-      </w:pPr>
-      <w:r>
-        <w:t xml:space="preserve">Karp PD, Weaver D, Latendresse M. (2018). How accurate is automated gap filling of metabolic models?</w:t>
+        <w:t xml:space="preserve">Nature</w:t>
+      </w:r>
+      <w:r>
+        <w:t xml:space="preserve">. 2018;557(7706):503–509. doi:10.1038/s41586-018-0124-0. PMID: 29769716.</w:t>
+      </w:r>
+    </w:p>
+    <w:p>
+      <w:pPr>
+        <w:pStyle w:val="BodyText"/>
+      </w:pPr>
+      <w:r>
+        <w:t xml:space="preserve">[11] Price MN, Deutschbauer AM, Arkin AP. GapMind: automated annotation of amino acid biosynthesis.</w:t>
       </w:r>
       <w:r>
         <w:t xml:space="preserve"> </w:t>
@@ -3693,18 +4099,18 @@
           <w:iCs/>
           <w:i/>
         </w:rPr>
-        <w:t xml:space="preserve">BMC Systems Biology</w:t>
-      </w:r>
-      <w:r>
-        <w:t xml:space="preserve">, 12:73. PMID: 29973189.</w:t>
-      </w:r>
-    </w:p>
-    <w:p>
-      <w:pPr>
-        <w:pStyle w:val="BodyText"/>
-      </w:pPr>
-      <w:r>
-        <w:t xml:space="preserve">Kumar VS, Dasika MS, Maranas CD. (2007). Optimization based automated curation of metabolic reconstructions.</w:t>
+        <w:t xml:space="preserve">mSystems</w:t>
+      </w:r>
+      <w:r>
+        <w:t xml:space="preserve">. 2020;5(3):e00291-20. doi:10.1128/mSystems.00291-20. PMID: 32518168.</w:t>
+      </w:r>
+    </w:p>
+    <w:p>
+      <w:pPr>
+        <w:pStyle w:val="BodyText"/>
+      </w:pPr>
+      <w:r>
+        <w:t xml:space="preserve">[12] Benedict MN, Mundy MB, Henry CS, Ber A, Thiele I. Likelihood-based gene annotations for gap filling and quality assessment in genome-scale metabolic models.</w:t>
       </w:r>
       <w:r>
         <w:t xml:space="preserve"> </w:t>
@@ -3714,18 +4120,18 @@
           <w:iCs/>
           <w:i/>
         </w:rPr>
-        <w:t xml:space="preserve">BMC Bioinformatics</w:t>
-      </w:r>
-      <w:r>
-        <w:t xml:space="preserve">, 8:212. PMID: 17584497.</w:t>
-      </w:r>
-    </w:p>
-    <w:p>
-      <w:pPr>
-        <w:pStyle w:val="BodyText"/>
-      </w:pPr>
-      <w:r>
-        <w:t xml:space="preserve">Omelchenko MV, Galperin MY, Wolf YI, Koonin EV. (2010). Non-homologous isofunctional enzymes: a systematic analysis of alternative solutions in enzyme evolution.</w:t>
+        <w:t xml:space="preserve">PLoS Computational Biology</w:t>
+      </w:r>
+      <w:r>
+        <w:t xml:space="preserve">. 2014;10(10):e1003882. doi:10.1371/journal.pcbi.1003882. PMID: 25329157.</w:t>
+      </w:r>
+    </w:p>
+    <w:p>
+      <w:pPr>
+        <w:pStyle w:val="BodyText"/>
+      </w:pPr>
+      <w:r>
+        <w:t xml:space="preserve">[13] Zimmermann J, Kaleta C, Waschina S. gapseq: informed prediction of bacterial metabolic pathways and reconstruction of accurate metabolic models.</w:t>
       </w:r>
       <w:r>
         <w:t xml:space="preserve"> </w:t>
@@ -3735,18 +4141,18 @@
           <w:iCs/>
           <w:i/>
         </w:rPr>
-        <w:t xml:space="preserve">Biology Direct</w:t>
-      </w:r>
-      <w:r>
-        <w:t xml:space="preserve">, 5:31. PMID: 20433725.</w:t>
-      </w:r>
-    </w:p>
-    <w:p>
-      <w:pPr>
-        <w:pStyle w:val="BodyText"/>
-      </w:pPr>
-      <w:r>
-        <w:t xml:space="preserve">Orth JD, Palsson BO. (2010). Systematizing the generation of missing metabolic knowledge.</w:t>
+        <w:t xml:space="preserve">Genome Biology</w:t>
+      </w:r>
+      <w:r>
+        <w:t xml:space="preserve">. 2021;22:81. doi:10.1186/s13059-021-02295-1. PMID: 33691770.</w:t>
+      </w:r>
+    </w:p>
+    <w:p>
+      <w:pPr>
+        <w:pStyle w:val="BodyText"/>
+      </w:pPr>
+      <w:r>
+        <w:t xml:space="preserve">[14] Borchert AJ, Bleem AC, Lim HG, et al. Machine learning analysis of RB-TnSeq fitness data predicts functional gene modules in</w:t>
       </w:r>
       <w:r>
         <w:t xml:space="preserve"> </w:t>
@@ -3756,18 +4162,13 @@
           <w:iCs/>
           <w:i/>
         </w:rPr>
-        <w:t xml:space="preserve">Biotechnology and Bioengineering</w:t>
-      </w:r>
-      <w:r>
-        <w:t xml:space="preserve">, 107(3):403–412. PMID: 20589842.</w:t>
-      </w:r>
-    </w:p>
-    <w:p>
-      <w:pPr>
-        <w:pStyle w:val="BodyText"/>
-      </w:pPr>
-      <w:r>
-        <w:t xml:space="preserve">Price MN, Deutschbauer AM, Arkin AP. (2020). GapMind: automated annotation of amino acid biosynthesis.</w:t>
+        <w:t xml:space="preserve">Pseudomonas putida</w:t>
+      </w:r>
+      <w:r>
+        <w:t xml:space="preserve"> </w:t>
+      </w:r>
+      <w:r>
+        <w:t xml:space="preserve">KT2440.</w:t>
       </w:r>
       <w:r>
         <w:t xml:space="preserve"> </w:t>
@@ -3780,15 +4181,15 @@
         <w:t xml:space="preserve">mSystems</w:t>
       </w:r>
       <w:r>
-        <w:t xml:space="preserve">, 5(3):e00291-20. PMID: 32518168.</w:t>
-      </w:r>
-    </w:p>
-    <w:p>
-      <w:pPr>
-        <w:pStyle w:val="BodyText"/>
-      </w:pPr>
-      <w:r>
-        <w:t xml:space="preserve">Price MN, Deutschbauer AM, Arkin AP. (2022). Filling gaps in bacterial catabolic pathways with computation and high-throughput genetics.</w:t>
+        <w:t xml:space="preserve">. 2024;9(3):e00942-23. doi:10.1128/msystems.00942-23. PMID: 38323821.</w:t>
+      </w:r>
+    </w:p>
+    <w:p>
+      <w:pPr>
+        <w:pStyle w:val="BodyText"/>
+      </w:pPr>
+      <w:r>
+        <w:t xml:space="preserve">[15] Arkin AP, Cottingham RW, Henry CS, et al. KBase: The United States Department of Energy Systems Biology Knowledgebase.</w:t>
       </w:r>
       <w:r>
         <w:t xml:space="preserve"> </w:t>
@@ -3798,18 +4199,18 @@
           <w:iCs/>
           <w:i/>
         </w:rPr>
-        <w:t xml:space="preserve">PLoS Genetics</w:t>
-      </w:r>
-      <w:r>
-        <w:t xml:space="preserve">, 18(4):e1010156. PMID: 35417454.</w:t>
-      </w:r>
-    </w:p>
-    <w:p>
-      <w:pPr>
-        <w:pStyle w:val="BodyText"/>
-      </w:pPr>
-      <w:r>
-        <w:t xml:space="preserve">Price MN, Wetmore KM, Waters RJ, et al. (2018). Mutant phenotypes for thousands of bacterial genes of unknown function.</w:t>
+        <w:t xml:space="preserve">Nature Biotechnology</w:t>
+      </w:r>
+      <w:r>
+        <w:t xml:space="preserve">. 2018;36(7):566–569. doi:10.1038/nbt.4163. PMID: 29979655.</w:t>
+      </w:r>
+    </w:p>
+    <w:p>
+      <w:pPr>
+        <w:pStyle w:val="BodyText"/>
+      </w:pPr>
+      <w:r>
+        <w:t xml:space="preserve">[16] Buchfink B, Xie C, Huson DH. Fast and sensitive protein alignment using DIAMOND.</w:t>
       </w:r>
       <w:r>
         <w:t xml:space="preserve"> </w:t>
@@ -3819,18 +4220,18 @@
           <w:iCs/>
           <w:i/>
         </w:rPr>
-        <w:t xml:space="preserve">Nature</w:t>
-      </w:r>
-      <w:r>
-        <w:t xml:space="preserve">, 557(7706):503–509. PMID: 29769716.</w:t>
-      </w:r>
-    </w:p>
-    <w:p>
-      <w:pPr>
-        <w:pStyle w:val="BodyText"/>
-      </w:pPr>
-      <w:r>
-        <w:t xml:space="preserve">Ryu JY, Kim HU, Lee SY. (2019). Deep learning enables high-quality and high-throughput prediction of enzyme commission numbers.</w:t>
+        <w:t xml:space="preserve">Nature Methods</w:t>
+      </w:r>
+      <w:r>
+        <w:t xml:space="preserve">. 2015;12(1):59–60. doi:10.1038/nmeth.3176. PMID: 25402007.</w:t>
+      </w:r>
+    </w:p>
+    <w:p>
+      <w:pPr>
+        <w:pStyle w:val="BodyText"/>
+      </w:pPr>
+      <w:r>
+        <w:t xml:space="preserve">[17] Ebrahim A, Lerman JA, Palsson BO, Hyduke DR. COBRApy: COnstraints-Based Reconstruction and Analysis for Python.</w:t>
       </w:r>
       <w:r>
         <w:t xml:space="preserve"> </w:t>
@@ -3840,18 +4241,18 @@
           <w:iCs/>
           <w:i/>
         </w:rPr>
-        <w:t xml:space="preserve">Proceedings of the National Academy of Sciences</w:t>
-      </w:r>
-      <w:r>
-        <w:t xml:space="preserve">, 116(28):13996–14001. PMID: 31235599.</w:t>
-      </w:r>
-    </w:p>
-    <w:p>
-      <w:pPr>
-        <w:pStyle w:val="BodyText"/>
-      </w:pPr>
-      <w:r>
-        <w:t xml:space="preserve">Schwengers O, Jelonek L, Giber MA, Underminer F, By KJ, By K, Modern L, Modern R, By P, Goesmann A. (2021). Bakta: rapid and standardized annotation of bacterial genomes via a comprehensive and curated database.</w:t>
+        <w:t xml:space="preserve">BMC Systems Biology</w:t>
+      </w:r>
+      <w:r>
+        <w:t xml:space="preserve">. 2013;7:74. doi:10.1186/1752-0509-7-74. PMID: 23927696.</w:t>
+      </w:r>
+    </w:p>
+    <w:p>
+      <w:pPr>
+        <w:pStyle w:val="BodyText"/>
+      </w:pPr>
+      <w:r>
+        <w:t xml:space="preserve">[18] Price MN, Deutschbauer AM, Arkin AP. Filling gaps in bacterial catabolic pathways with computation and high-throughput genetics.</w:t>
       </w:r>
       <w:r>
         <w:t xml:space="preserve"> </w:t>
@@ -3861,18 +4262,18 @@
           <w:iCs/>
           <w:i/>
         </w:rPr>
-        <w:t xml:space="preserve">Microbial Genomics</w:t>
-      </w:r>
-      <w:r>
-        <w:t xml:space="preserve">, 7(11):000685. PMID: 34739369.</w:t>
-      </w:r>
-    </w:p>
-    <w:p>
-      <w:pPr>
-        <w:pStyle w:val="BodyText"/>
-      </w:pPr>
-      <w:r>
-        <w:t xml:space="preserve">Seemann T. (2014). Prokka: rapid prokaryotic genome annotation.</w:t>
+        <w:t xml:space="preserve">PLoS Genetics</w:t>
+      </w:r>
+      <w:r>
+        <w:t xml:space="preserve">. 2022;18(4):e1010156. doi:10.1371/journal.pgen.1010156. PMID: 35417454.</w:t>
+      </w:r>
+    </w:p>
+    <w:p>
+      <w:pPr>
+        <w:pStyle w:val="BodyText"/>
+      </w:pPr>
+      <w:r>
+        <w:t xml:space="preserve">[19] Ryu JY, Kim HU, Lee SY. Deep learning enables high-quality and high-throughput prediction of enzyme commission numbers.</w:t>
       </w:r>
       <w:r>
         <w:t xml:space="preserve"> </w:t>
@@ -3882,18 +4283,18 @@
           <w:iCs/>
           <w:i/>
         </w:rPr>
-        <w:t xml:space="preserve">Bioinformatics</w:t>
-      </w:r>
-      <w:r>
-        <w:t xml:space="preserve">, 30(14):2068–2069. PMID: 24642063.</w:t>
-      </w:r>
-    </w:p>
-    <w:p>
-      <w:pPr>
-        <w:pStyle w:val="BodyText"/>
-      </w:pPr>
-      <w:r>
-        <w:t xml:space="preserve">Thiele I, Palsson BO. (2010). A protocol for generating a high-quality genome-scale metabolic reconstruction.</w:t>
+        <w:t xml:space="preserve">Proceedings of the National Academy of Sciences</w:t>
+      </w:r>
+      <w:r>
+        <w:t xml:space="preserve">. 2019;116(28):13996–14001. doi:10.1073/pnas.1821905116. PMID: 31235599.</w:t>
+      </w:r>
+    </w:p>
+    <w:p>
+      <w:pPr>
+        <w:pStyle w:val="BodyText"/>
+      </w:pPr>
+      <w:r>
+        <w:t xml:space="preserve">[20] Yu T, Cui H, Li JC, et al. Enzyme function prediction using contrastive learning.</w:t>
       </w:r>
       <w:r>
         <w:t xml:space="preserve"> </w:t>
@@ -3903,18 +4304,18 @@
           <w:iCs/>
           <w:i/>
         </w:rPr>
-        <w:t xml:space="preserve">Nature Protocols</w:t>
-      </w:r>
-      <w:r>
-        <w:t xml:space="preserve">, 5(1):93–121. PMID: 20057383.</w:t>
-      </w:r>
-    </w:p>
-    <w:p>
-      <w:pPr>
-        <w:pStyle w:val="BodyText"/>
-      </w:pPr>
-      <w:r>
-        <w:t xml:space="preserve">Wetmore KM, Price MN, Waters RJ, et al. (2015). Rapid quantification of mutant fitness in diverse bacteria by sequencing randomly bar-coded transposons.</w:t>
+        <w:t xml:space="preserve">Science</w:t>
+      </w:r>
+      <w:r>
+        <w:t xml:space="preserve">. 2023;379(6639):1358–1363. doi:10.1126/science.adf2465. PMID: 36996195.</w:t>
+      </w:r>
+    </w:p>
+    <w:p>
+      <w:pPr>
+        <w:pStyle w:val="BodyText"/>
+      </w:pPr>
+      <w:r>
+        <w:t xml:space="preserve">[21] Deutschbauer A, Price MN, Wetmore KM, et al. Evidence-based annotation of gene function in</w:t>
       </w:r>
       <w:r>
         <w:t xml:space="preserve"> </w:t>
@@ -3924,18 +4325,13 @@
           <w:iCs/>
           <w:i/>
         </w:rPr>
-        <w:t xml:space="preserve">mBio</w:t>
-      </w:r>
-      <w:r>
-        <w:t xml:space="preserve">, 6(3):e00306-15. DOI: 10.1128/mBio.00306-15. PMID: 25968644.</w:t>
-      </w:r>
-    </w:p>
-    <w:p>
-      <w:pPr>
-        <w:pStyle w:val="BodyText"/>
-      </w:pPr>
-      <w:r>
-        <w:t xml:space="preserve">Yu T, Cui H, Li JC, et al. (2023). Enzyme function prediction using contrastive learning.</w:t>
+        <w:t xml:space="preserve">Shewanella oneidensis</w:t>
+      </w:r>
+      <w:r>
+        <w:t xml:space="preserve"> </w:t>
+      </w:r>
+      <w:r>
+        <w:t xml:space="preserve">MR-1 using genome-wide fitness profiling across 121 conditions.</w:t>
       </w:r>
       <w:r>
         <w:t xml:space="preserve"> </w:t>
@@ -3945,18 +4341,18 @@
           <w:iCs/>
           <w:i/>
         </w:rPr>
-        <w:t xml:space="preserve">Science</w:t>
-      </w:r>
-      <w:r>
-        <w:t xml:space="preserve">, 379(6639):1358–1363. PMID: 36996195.</w:t>
-      </w:r>
-    </w:p>
-    <w:p>
-      <w:pPr>
-        <w:pStyle w:val="BodyText"/>
-      </w:pPr>
-      <w:r>
-        <w:t xml:space="preserve">Zimmermann J, Kaleta C, Waschina S. (2021). gapseq: informed prediction of bacterial metabolic pathways and reconstruction of accurate metabolic models.</w:t>
+        <w:t xml:space="preserve">PLoS Genetics</w:t>
+      </w:r>
+      <w:r>
+        <w:t xml:space="preserve">. 2011;7(11):e1002385. doi:10.1371/journal.pgen.1002385. PMID: 22125499.</w:t>
+      </w:r>
+    </w:p>
+    <w:p>
+      <w:pPr>
+        <w:pStyle w:val="BodyText"/>
+      </w:pPr>
+      <w:r>
+        <w:t xml:space="preserve">[22] Karp PD, Weaver D, Latendresse M. How accurate is automated gap filling of metabolic models?</w:t>
       </w:r>
       <w:r>
         <w:t xml:space="preserve"> </w:t>
@@ -3966,10 +4362,10 @@
           <w:iCs/>
           <w:i/>
         </w:rPr>
-        <w:t xml:space="preserve">Genome Biology</w:t>
-      </w:r>
-      <w:r>
-        <w:t xml:space="preserve">, 22:81. DOI: 10.1186/s13059-021-02295-1. PMID: 33691770.</w:t>
+        <w:t xml:space="preserve">BMC Systems Biology</w:t>
+      </w:r>
+      <w:r>
+        <w:t xml:space="preserve">. 2018;12:73. doi:10.1186/s12918-018-0593-7. PMID: 29973189.</w:t>
       </w:r>
     </w:p>
     <w:p>
@@ -3979,8 +4375,8 @@
         </w:pict>
       </w:r>
     </w:p>
-    <w:bookmarkEnd w:id="53"/>
-    <w:bookmarkStart w:id="57" w:name="supplementary-materials"/>
+    <w:bookmarkEnd w:id="70"/>
+    <w:bookmarkStart w:id="101" w:name="supplementary-materials"/>
     <w:p>
       <w:pPr>
         <w:pStyle w:val="Heading2"/>
@@ -3989,7 +4385,7 @@
         <w:t xml:space="preserve">Supplementary Materials</w:t>
       </w:r>
     </w:p>
-    <w:bookmarkStart w:id="54" w:name="X74a4764d2221650460a42b8af8633ba2faf13d2"/>
+    <w:bookmarkStart w:id="74" w:name="X74a4764d2221650460a42b8af8633ba2faf13d2"/>
     <w:p>
       <w:pPr>
         <w:pStyle w:val="Heading3"/>
@@ -4000,18 +4396,571 @@
     </w:p>
     <w:p>
       <w:pPr>
+        <w:pStyle w:val="CaptionedFigure"/>
+      </w:pPr>
+      <w:r>
+        <w:drawing>
+          <wp:inline>
+            <wp:extent cx="5334000" cy="4166867"/>
+            <wp:effectExtent b="0" l="0" r="0" t="0"/>
+            <wp:docPr descr="Supplementary Figure S1. Threshold sensitivity analysis across 240 parameter combinations. (A) Resolution rate as a function of fitness threshold (FIT_THRESHOLD) for three t-statistic cutoffs (|t| &gt; 3.0, 4.0, 5.0), averaged over all BLAST threshold combinations. Fitness thresholds have negligible impact on overall resolution. (B) BLAST threshold sensitivity heatmap showing resolution rate at each combination of minimum percent identity and minimum query coverage, at baseline fitness thresholds (FIT_THRESHOLD = -2.0, T_THRESHOLD = 4.0). The red box marks the baseline (30% identity, 70% coverage). BLAST identity is the dominant parameter affecting resolution. (C) Number of high-confidence assignments as a function of fitness threshold at baseline BLAST thresholds. High-confidence counts range from 35 to 47 across all tested parameter combinations. (D) Histogram of resolution rates across all 240 threshold combinations, with the baseline (47.8%, red dashed line) and H1 threshold (30%, orange dotted line) indicated. All 240 combinations exceed both thresholds, confirming that the conclusion is robust to parameter choice." title="" id="72" name="Picture"/>
+            <a:graphic>
+              <a:graphicData uri="http://schemas.openxmlformats.org/drawingml/2006/picture">
+                <pic:pic>
+                  <pic:nvPicPr>
+                    <pic:cNvPr descr="figures/supplement_threshold_sensitivity.png" id="73" name="Picture"/>
+                    <pic:cNvPicPr>
+                      <a:picLocks noChangeArrowheads="1" noChangeAspect="1"/>
+                    </pic:cNvPicPr>
+                  </pic:nvPicPr>
+                  <pic:blipFill>
+                    <a:blip r:embed="rId71"/>
+                    <a:stretch>
+                      <a:fillRect/>
+                    </a:stretch>
+                  </pic:blipFill>
+                  <pic:spPr bwMode="auto">
+                    <a:xfrm>
+                      <a:off x="0" y="0"/>
+                      <a:ext cx="5334000" cy="4166867"/>
+                    </a:xfrm>
+                    <a:prstGeom prst="rect">
+                      <a:avLst/>
+                    </a:prstGeom>
+                    <a:noFill/>
+                    <a:ln w="9525">
+                      <a:noFill/>
+                      <a:headEnd/>
+                      <a:tailEnd/>
+                    </a:ln>
+                  </pic:spPr>
+                </pic:pic>
+              </a:graphicData>
+            </a:graphic>
+          </wp:inline>
+        </w:drawing>
+      </w:r>
+    </w:p>
+    <w:p>
+      <w:pPr>
+        <w:pStyle w:val="ImageCaption"/>
+      </w:pPr>
+      <w:r>
+        <w:rPr>
+          <w:bCs/>
+          <w:b/>
+        </w:rPr>
+        <w:t xml:space="preserve">Supplementary Figure S1. Threshold sensitivity analysis across 240 parameter combinations.</w:t>
+      </w:r>
+      <w:r>
+        <w:t xml:space="preserve"> </w:t>
+      </w:r>
+      <w:r>
+        <w:t xml:space="preserve">(A) Resolution rate as a function of fitness threshold (FIT_THRESHOLD) for three t-statistic cutoffs (|t| &gt; 3.0, 4.0, 5.0), averaged over all BLAST threshold combinations. Fitness thresholds have negligible impact on overall resolution. (B) BLAST threshold sensitivity heatmap showing resolution rate at each combination of minimum percent identity and minimum query coverage, at baseline fitness thresholds (FIT_THRESHOLD = -2.0, T_THRESHOLD = 4.0). The red box marks the baseline (30% identity, 70% coverage). BLAST identity is the dominant parameter affecting resolution. (C) Number of high-confidence assignments as a function of fitness threshold at baseline BLAST thresholds. High-confidence counts range from 35 to 47 across all tested parameter combinations. (D) Histogram of resolution rates across all 240 threshold combinations, with the baseline (47.8%, red dashed line) and H1 threshold (30%, orange dotted line) indicated. All 240 combinations exceed both thresholds, confirming that the conclusion is robust to parameter choice.</w:t>
+      </w:r>
+    </w:p>
+    <w:bookmarkEnd w:id="74"/>
+    <w:bookmarkStart w:id="78" w:name="Xbe2b21c0cbad7a54f9da62a0c68d46d73c6ffba"/>
+    <w:p>
+      <w:pPr>
+        <w:pStyle w:val="Heading3"/>
+      </w:pPr>
+      <w:r>
+        <w:t xml:space="preserve">Supplementary Figure S2: NB03 Annotation Gap Resolution Heatmap</w:t>
+      </w:r>
+    </w:p>
+    <w:p>
+      <w:pPr>
+        <w:pStyle w:val="CaptionedFigure"/>
+      </w:pPr>
+      <w:r>
+        <w:drawing>
+          <wp:inline>
+            <wp:extent cx="5334000" cy="2799943"/>
+            <wp:effectExtent b="0" l="0" r="0" t="0"/>
+            <wp:docPr descr="Supplementary Figure S2. EC-based annotation gap resolution across organisms and carbon sources (NB03 stage). Heatmap showing the percentage of gapfilled reactions with identified gene candidates for each organism-carbon source combination after NB03 EC-based matching. Darker colors indicate higher resolution rates. Many organism-carbon source combinations show 0% resolution at the NB03 stage, demonstrating the need for additional evidence streams (NB04 Bakta annotations and NB06 BLAST homology) to achieve the final 47.8% resolution rate." title="" id="76" name="Picture"/>
+            <a:graphic>
+              <a:graphicData uri="http://schemas.openxmlformats.org/drawingml/2006/picture">
+                <pic:pic>
+                  <pic:nvPicPr>
+                    <pic:cNvPr descr="figures/annotation_gap_resolution_heatmap.png" id="77" name="Picture"/>
+                    <pic:cNvPicPr>
+                      <a:picLocks noChangeArrowheads="1" noChangeAspect="1"/>
+                    </pic:cNvPicPr>
+                  </pic:nvPicPr>
+                  <pic:blipFill>
+                    <a:blip r:embed="rId75"/>
+                    <a:stretch>
+                      <a:fillRect/>
+                    </a:stretch>
+                  </pic:blipFill>
+                  <pic:spPr bwMode="auto">
+                    <a:xfrm>
+                      <a:off x="0" y="0"/>
+                      <a:ext cx="5334000" cy="2799943"/>
+                    </a:xfrm>
+                    <a:prstGeom prst="rect">
+                      <a:avLst/>
+                    </a:prstGeom>
+                    <a:noFill/>
+                    <a:ln w="9525">
+                      <a:noFill/>
+                      <a:headEnd/>
+                      <a:tailEnd/>
+                    </a:ln>
+                  </pic:spPr>
+                </pic:pic>
+              </a:graphicData>
+            </a:graphic>
+          </wp:inline>
+        </w:drawing>
+      </w:r>
+    </w:p>
+    <w:p>
+      <w:pPr>
+        <w:pStyle w:val="ImageCaption"/>
+      </w:pPr>
+      <w:r>
+        <w:rPr>
+          <w:bCs/>
+          <w:b/>
+        </w:rPr>
+        <w:t xml:space="preserve">Supplementary Figure S2. EC-based annotation gap resolution across organisms and carbon sources (NB03 stage).</w:t>
+      </w:r>
+      <w:r>
+        <w:t xml:space="preserve"> </w:t>
+      </w:r>
+      <w:r>
+        <w:t xml:space="preserve">Heatmap showing the percentage of gapfilled reactions with identified gene candidates for each organism-carbon source combination after NB03 EC-based matching. Darker colors indicate higher resolution rates. Many organism-carbon source combinations show 0% resolution at the NB03 stage, demonstrating the need for additional evidence streams (NB04 Bakta annotations and NB06 BLAST homology) to achieve the final 47.8% resolution rate.</w:t>
+      </w:r>
+    </w:p>
+    <w:bookmarkEnd w:id="78"/>
+    <w:bookmarkStart w:id="82" w:name="X7eca35a11912d55ddf79221018792f1b525bb34"/>
+    <w:p>
+      <w:pPr>
+        <w:pStyle w:val="Heading3"/>
+      </w:pPr>
+      <w:r>
+        <w:t xml:space="preserve">Supplementary Figure S3: Evidence Distribution from NB03</w:t>
+      </w:r>
+    </w:p>
+    <w:p>
+      <w:pPr>
+        <w:pStyle w:val="CaptionedFigure"/>
+      </w:pPr>
+      <w:r>
+        <w:drawing>
+          <wp:inline>
+            <wp:extent cx="5334000" cy="1870995"/>
+            <wp:effectExtent b="0" l="0" r="0" t="0"/>
+            <wp:docPr descr="Supplementary Figure S3. NB03 candidate gene evidence classification. Left panel: Confidence distribution of 107 gene candidates identified by EC matching, showing 12 high-confidence, 11 medium, and 84 low-confidence candidates. Right panel: Fitness evidence classification showing 33 candidates with strong fitness support (fitness &lt; -2.0, |t| &gt; 4.0), 5 moderate, 54 non-significant, and 36 with no fitness data available." title="" id="80" name="Picture"/>
+            <a:graphic>
+              <a:graphicData uri="http://schemas.openxmlformats.org/drawingml/2006/picture">
+                <pic:pic>
+                  <pic:nvPicPr>
+                    <pic:cNvPr descr="figures/evidence_distribution.png" id="81" name="Picture"/>
+                    <pic:cNvPicPr>
+                      <a:picLocks noChangeArrowheads="1" noChangeAspect="1"/>
+                    </pic:cNvPicPr>
+                  </pic:nvPicPr>
+                  <pic:blipFill>
+                    <a:blip r:embed="rId79"/>
+                    <a:stretch>
+                      <a:fillRect/>
+                    </a:stretch>
+                  </pic:blipFill>
+                  <pic:spPr bwMode="auto">
+                    <a:xfrm>
+                      <a:off x="0" y="0"/>
+                      <a:ext cx="5334000" cy="1870995"/>
+                    </a:xfrm>
+                    <a:prstGeom prst="rect">
+                      <a:avLst/>
+                    </a:prstGeom>
+                    <a:noFill/>
+                    <a:ln w="9525">
+                      <a:noFill/>
+                      <a:headEnd/>
+                      <a:tailEnd/>
+                    </a:ln>
+                  </pic:spPr>
+                </pic:pic>
+              </a:graphicData>
+            </a:graphic>
+          </wp:inline>
+        </w:drawing>
+      </w:r>
+    </w:p>
+    <w:p>
+      <w:pPr>
+        <w:pStyle w:val="ImageCaption"/>
+      </w:pPr>
+      <w:r>
+        <w:rPr>
+          <w:bCs/>
+          <w:b/>
+        </w:rPr>
+        <w:t xml:space="preserve">Supplementary Figure S3. NB03 candidate gene evidence classification.</w:t>
+      </w:r>
+      <w:r>
+        <w:t xml:space="preserve"> </w:t>
+      </w:r>
+      <w:r>
+        <w:t xml:space="preserve">Left panel: Confidence distribution of 107 gene candidates identified by EC matching, showing 12 high-confidence, 11 medium, and 84 low-confidence candidates. Right panel: Fitness evidence classification showing 33 candidates with strong fitness support (fitness &lt; -2.0, |t| &gt; 4.0), 5 moderate, 54 non-significant, and 36 with no fitness data available.</w:t>
+      </w:r>
+    </w:p>
+    <w:bookmarkEnd w:id="82"/>
+    <w:bookmarkStart w:id="86" w:name="X492d7752420a3447f301c03f8e5fdd53714dac9"/>
+    <w:p>
+      <w:pPr>
+        <w:pStyle w:val="Heading3"/>
+      </w:pPr>
+      <w:r>
+        <w:t xml:space="preserve">Supplementary Figure S4: GapMind Score Categories</w:t>
+      </w:r>
+    </w:p>
+    <w:p>
+      <w:pPr>
+        <w:pStyle w:val="CaptionedFigure"/>
+      </w:pPr>
+      <w:r>
+        <w:drawing>
+          <wp:inline>
+            <wp:extent cx="5334000" cy="2631056"/>
+            <wp:effectExtent b="0" l="0" r="0" t="0"/>
+            <wp:docPr descr="Supplementary Figure S4. GapMind pathway score category distribution for focal genomes. Bar chart showing the distribution of GapMind pathway completeness categories (complete, likely complete, steps missing low/medium, not present) across the 14 focal organisms. This provides context for the GapMind concordance analysis in Figure 5 — pathways scored as “not present” or “steps missing” represent independent evidence for annotation gaps." title="" id="84" name="Picture"/>
+            <a:graphic>
+              <a:graphicData uri="http://schemas.openxmlformats.org/drawingml/2006/picture">
+                <pic:pic>
+                  <pic:nvPicPr>
+                    <pic:cNvPr descr="figures/gapmind_score_categories.png" id="85" name="Picture"/>
+                    <pic:cNvPicPr>
+                      <a:picLocks noChangeArrowheads="1" noChangeAspect="1"/>
+                    </pic:cNvPicPr>
+                  </pic:nvPicPr>
+                  <pic:blipFill>
+                    <a:blip r:embed="rId83"/>
+                    <a:stretch>
+                      <a:fillRect/>
+                    </a:stretch>
+                  </pic:blipFill>
+                  <pic:spPr bwMode="auto">
+                    <a:xfrm>
+                      <a:off x="0" y="0"/>
+                      <a:ext cx="5334000" cy="2631056"/>
+                    </a:xfrm>
+                    <a:prstGeom prst="rect">
+                      <a:avLst/>
+                    </a:prstGeom>
+                    <a:noFill/>
+                    <a:ln w="9525">
+                      <a:noFill/>
+                      <a:headEnd/>
+                      <a:tailEnd/>
+                    </a:ln>
+                  </pic:spPr>
+                </pic:pic>
+              </a:graphicData>
+            </a:graphic>
+          </wp:inline>
+        </w:drawing>
+      </w:r>
+    </w:p>
+    <w:p>
+      <w:pPr>
+        <w:pStyle w:val="ImageCaption"/>
+      </w:pPr>
+      <w:r>
+        <w:rPr>
+          <w:bCs/>
+          <w:b/>
+        </w:rPr>
+        <w:t xml:space="preserve">Supplementary Figure S4. GapMind pathway score category distribution for focal genomes.</w:t>
+      </w:r>
+      <w:r>
+        <w:t xml:space="preserve"> </w:t>
+      </w:r>
+      <w:r>
+        <w:t xml:space="preserve">Bar chart showing the distribution of GapMind pathway completeness categories (complete, likely complete, steps missing low/medium, not present) across the 14 focal organisms. This provides context for the GapMind concordance analysis in Figure 5 — pathways scored as</w:t>
+      </w:r>
+      <w:r>
+        <w:t xml:space="preserve"> </w:t>
+      </w:r>
+      <w:r>
+        <w:t xml:space="preserve">“</w:t>
+      </w:r>
+      <w:r>
+        <w:t xml:space="preserve">not present</w:t>
+      </w:r>
+      <w:r>
+        <w:t xml:space="preserve">”</w:t>
+      </w:r>
+      <w:r>
+        <w:t xml:space="preserve"> </w:t>
+      </w:r>
+      <w:r>
+        <w:t xml:space="preserve">or</w:t>
+      </w:r>
+      <w:r>
+        <w:t xml:space="preserve"> </w:t>
+      </w:r>
+      <w:r>
+        <w:t xml:space="preserve">“</w:t>
+      </w:r>
+      <w:r>
+        <w:t xml:space="preserve">steps missing</w:t>
+      </w:r>
+      <w:r>
+        <w:t xml:space="preserve">”</w:t>
+      </w:r>
+      <w:r>
+        <w:t xml:space="preserve"> </w:t>
+      </w:r>
+      <w:r>
+        <w:t xml:space="preserve">represent independent evidence for annotation gaps.</w:t>
+      </w:r>
+    </w:p>
+    <w:bookmarkEnd w:id="86"/>
+    <w:bookmarkStart w:id="90" w:name="Xeed1909bfe76bf66d53045b02d133ec1635c70f"/>
+    <w:p>
+      <w:pPr>
+        <w:pStyle w:val="Heading3"/>
+      </w:pPr>
+      <w:r>
+        <w:t xml:space="preserve">Supplementary Figure S5: NB04 Candidate Evidence Sources</w:t>
+      </w:r>
+    </w:p>
+    <w:p>
+      <w:pPr>
+        <w:pStyle w:val="CaptionedFigure"/>
+      </w:pPr>
+      <w:r>
+        <w:drawing>
+          <wp:inline>
+            <wp:extent cx="5334000" cy="2621949"/>
+            <wp:effectExtent b="0" l="0" r="0" t="0"/>
+            <wp:docPr descr="Supplementary Figure S5. Evidence source breakdown from NB04 Bakta annotation analysis. Distribution of newly identified gene candidates by evidence source (Bakta EC match, Bakta product-name match, GapMind concordance). NB04 added 22 newly resolved reaction-organism pairs (10.9% incremental resolution) primarily through alternative EC annotations from the Bakta pipeline, demonstrating the value of cross-referencing multiple annotation sources." title="" id="88" name="Picture"/>
+            <a:graphic>
+              <a:graphicData uri="http://schemas.openxmlformats.org/drawingml/2006/picture">
+                <pic:pic>
+                  <pic:nvPicPr>
+                    <pic:cNvPr descr="figures/nb04_candidate_sources.png" id="89" name="Picture"/>
+                    <pic:cNvPicPr>
+                      <a:picLocks noChangeArrowheads="1" noChangeAspect="1"/>
+                    </pic:cNvPicPr>
+                  </pic:nvPicPr>
+                  <pic:blipFill>
+                    <a:blip r:embed="rId87"/>
+                    <a:stretch>
+                      <a:fillRect/>
+                    </a:stretch>
+                  </pic:blipFill>
+                  <pic:spPr bwMode="auto">
+                    <a:xfrm>
+                      <a:off x="0" y="0"/>
+                      <a:ext cx="5334000" cy="2621949"/>
+                    </a:xfrm>
+                    <a:prstGeom prst="rect">
+                      <a:avLst/>
+                    </a:prstGeom>
+                    <a:noFill/>
+                    <a:ln w="9525">
+                      <a:noFill/>
+                      <a:headEnd/>
+                      <a:tailEnd/>
+                    </a:ln>
+                  </pic:spPr>
+                </pic:pic>
+              </a:graphicData>
+            </a:graphic>
+          </wp:inline>
+        </w:drawing>
+      </w:r>
+    </w:p>
+    <w:p>
+      <w:pPr>
+        <w:pStyle w:val="ImageCaption"/>
+      </w:pPr>
+      <w:r>
+        <w:rPr>
+          <w:bCs/>
+          <w:b/>
+        </w:rPr>
+        <w:t xml:space="preserve">Supplementary Figure S5. Evidence source breakdown from NB04 Bakta annotation analysis.</w:t>
+      </w:r>
+      <w:r>
+        <w:t xml:space="preserve"> </w:t>
+      </w:r>
+      <w:r>
+        <w:t xml:space="preserve">Distribution of newly identified gene candidates by evidence source (Bakta EC match, Bakta product-name match, GapMind concordance). NB04 added 22 newly resolved reaction-organism pairs (10.9% incremental resolution) primarily through alternative EC annotations from the Bakta pipeline, demonstrating the value of cross-referencing multiple annotation sources.</w:t>
+      </w:r>
+    </w:p>
+    <w:bookmarkEnd w:id="90"/>
+    <w:bookmarkStart w:id="94" w:name="Xd0f05df2444fd73633734cfa1c533fd678ff3a6"/>
+    <w:p>
+      <w:pPr>
+        <w:pStyle w:val="Heading3"/>
+      </w:pPr>
+      <w:r>
+        <w:t xml:space="preserve">Supplementary Figure S6: Fitness Specificity Analysis</w:t>
+      </w:r>
+    </w:p>
+    <w:p>
+      <w:pPr>
+        <w:pStyle w:val="CaptionedFigure"/>
+      </w:pPr>
+      <w:r>
+        <w:drawing>
+          <wp:inline>
+            <wp:extent cx="5334000" cy="1628155"/>
+            <wp:effectExtent b="0" l="0" r="0" t="0"/>
+            <wp:docPr descr="Supplementary Figure S6. Fitness specificity z-score distribution from NB05 expanded profiling. Distribution of fitness specificity z-scores for 71 candidate genes across all available carbon source experiments. Genes with high absolute z-scores show carbon-source-specific fitness defects (stronger candidates for specific pathway gaps), while those near zero show general fitness effects (weaker candidates). Four genes showed strong carbon-source-specific fitness defects." title="" id="92" name="Picture"/>
+            <a:graphic>
+              <a:graphicData uri="http://schemas.openxmlformats.org/drawingml/2006/picture">
+                <pic:pic>
+                  <pic:nvPicPr>
+                    <pic:cNvPr descr="figures/nb05_fitness_specificity.png" id="93" name="Picture"/>
+                    <pic:cNvPicPr>
+                      <a:picLocks noChangeArrowheads="1" noChangeAspect="1"/>
+                    </pic:cNvPicPr>
+                  </pic:nvPicPr>
+                  <pic:blipFill>
+                    <a:blip r:embed="rId91"/>
+                    <a:stretch>
+                      <a:fillRect/>
+                    </a:stretch>
+                  </pic:blipFill>
+                  <pic:spPr bwMode="auto">
+                    <a:xfrm>
+                      <a:off x="0" y="0"/>
+                      <a:ext cx="5334000" cy="1628155"/>
+                    </a:xfrm>
+                    <a:prstGeom prst="rect">
+                      <a:avLst/>
+                    </a:prstGeom>
+                    <a:noFill/>
+                    <a:ln w="9525">
+                      <a:noFill/>
+                      <a:headEnd/>
+                      <a:tailEnd/>
+                    </a:ln>
+                  </pic:spPr>
+                </pic:pic>
+              </a:graphicData>
+            </a:graphic>
+          </wp:inline>
+        </w:drawing>
+      </w:r>
+    </w:p>
+    <w:p>
+      <w:pPr>
+        <w:pStyle w:val="ImageCaption"/>
+      </w:pPr>
+      <w:r>
+        <w:rPr>
+          <w:bCs/>
+          <w:b/>
+        </w:rPr>
+        <w:t xml:space="preserve">Supplementary Figure S6. Fitness specificity z-score distribution from NB05 expanded profiling.</w:t>
+      </w:r>
+      <w:r>
+        <w:t xml:space="preserve"> </w:t>
+      </w:r>
+      <w:r>
+        <w:t xml:space="preserve">Distribution of fitness specificity z-scores for 71 candidate genes across all available carbon source experiments. Genes with high absolute z-scores show carbon-source-specific fitness defects (stronger candidates for specific pathway gaps), while those near zero show general fitness effects (weaker candidates). Four genes showed strong carbon-source-specific fitness defects.</w:t>
+      </w:r>
+    </w:p>
+    <w:bookmarkEnd w:id="94"/>
+    <w:bookmarkStart w:id="98" w:name="Xe0b74537634247439676f208e55b7b2faaa7d15"/>
+    <w:p>
+      <w:pPr>
+        <w:pStyle w:val="Heading3"/>
+      </w:pPr>
+      <w:r>
+        <w:t xml:space="preserve">Supplementary Figure S7: NB06 Triangulated Evidence Summary</w:t>
+      </w:r>
+    </w:p>
+    <w:p>
+      <w:pPr>
+        <w:pStyle w:val="CaptionedFigure"/>
+      </w:pPr>
+      <w:r>
+        <w:drawing>
+          <wp:inline>
+            <wp:extent cx="5334000" cy="1637592"/>
+            <wp:effectExtent b="0" l="0" r="0" t="0"/>
+            <wp:docPr descr="Supplementary Figure S7. Final evidence triangulation summary from NB06. Left panel: Resolution rate progression from NB03 EC matching (25.4%) through NB03+NB04 (36.3%) to the full pipeline including BLAST (47.8%). Center panel: Evidence source distribution showing the number of pairs resolved by single versus multiple evidence streams. Right panel: Final confidence pie chart showing 44 high (22%), 19 medium (9%), 33 low (16%), and 105 unresolved (52%)." title="" id="96" name="Picture"/>
+            <a:graphic>
+              <a:graphicData uri="http://schemas.openxmlformats.org/drawingml/2006/picture">
+                <pic:pic>
+                  <pic:nvPicPr>
+                    <pic:cNvPr descr="figures/nb06_triangulated_evidence.png" id="97" name="Picture"/>
+                    <pic:cNvPicPr>
+                      <a:picLocks noChangeArrowheads="1" noChangeAspect="1"/>
+                    </pic:cNvPicPr>
+                  </pic:nvPicPr>
+                  <pic:blipFill>
+                    <a:blip r:embed="rId95"/>
+                    <a:stretch>
+                      <a:fillRect/>
+                    </a:stretch>
+                  </pic:blipFill>
+                  <pic:spPr bwMode="auto">
+                    <a:xfrm>
+                      <a:off x="0" y="0"/>
+                      <a:ext cx="5334000" cy="1637592"/>
+                    </a:xfrm>
+                    <a:prstGeom prst="rect">
+                      <a:avLst/>
+                    </a:prstGeom>
+                    <a:noFill/>
+                    <a:ln w="9525">
+                      <a:noFill/>
+                      <a:headEnd/>
+                      <a:tailEnd/>
+                    </a:ln>
+                  </pic:spPr>
+                </pic:pic>
+              </a:graphicData>
+            </a:graphic>
+          </wp:inline>
+        </w:drawing>
+      </w:r>
+    </w:p>
+    <w:p>
+      <w:pPr>
+        <w:pStyle w:val="ImageCaption"/>
+      </w:pPr>
+      <w:r>
+        <w:rPr>
+          <w:bCs/>
+          <w:b/>
+        </w:rPr>
+        <w:t xml:space="preserve">Supplementary Figure S7. Final evidence triangulation summary from NB06.</w:t>
+      </w:r>
+      <w:r>
+        <w:t xml:space="preserve"> </w:t>
+      </w:r>
+      <w:r>
+        <w:t xml:space="preserve">Left panel: Resolution rate progression from NB03 EC matching (25.4%) through NB03+NB04 (36.3%) to the full pipeline including BLAST (47.8%). Center panel: Evidence source distribution showing the number of pairs resolved by single versus multiple evidence streams. Right panel: Final confidence pie chart showing 44 high (22%), 19 medium (9%), 33 low (16%), and 105 unresolved (52%).</w:t>
+      </w:r>
+    </w:p>
+    <w:bookmarkEnd w:id="98"/>
+    <w:bookmarkStart w:id="99" w:name="Xc07137d55c8f0b0a748f7e68dd02b803bfc937f"/>
+    <w:p>
+      <w:pPr>
+        <w:pStyle w:val="Heading3"/>
+      </w:pPr>
+      <w:r>
+        <w:t xml:space="preserve">Supplementary Table S1: Complete Threshold Sensitivity Results</w:t>
+      </w:r>
+    </w:p>
+    <w:p>
+      <w:pPr>
         <w:pStyle w:val="FirstParagraph"/>
       </w:pPr>
       <w:r>
-        <w:t xml:space="preserve">Four-panel figure showing: (A) Resolution rate as a function of fitness threshold for different t-statistic cutoffs; (B) BLAST threshold sensitivity heatmap (identity vs coverage); (C) High-confidence assignment count vs fitness threshold; (D) Distribution of resolution rates across all 240 parameter combinations. All combinations exceed the H1 threshold of 30%, with the baseline (47.8%) near the upper bound.</w:t>
-      </w:r>
-    </w:p>
-    <w:p>
-      <w:pPr>
-        <w:pStyle w:val="BodyText"/>
-      </w:pPr>
-      <w:r>
-        <w:t xml:space="preserve">See</w:t>
+        <w:t xml:space="preserve">240 rows covering all combinations of fitness thresholds (5 FIT_THRESHOLD values x 3 T_THRESHOLD values) and BLAST thresholds (4 identity values x 4 coverage values). Each row reports: resolved count, percent resolved, high/medium/low/unresolved counts. See</w:t>
       </w:r>
       <w:r>
         <w:t xml:space="preserve"> </w:t>
@@ -4020,35 +4969,20 @@
         <w:rPr>
           <w:rStyle w:val="VerbatimChar"/>
         </w:rPr>
-        <w:t xml:space="preserve">figures/supplement_threshold_sensitivity.png</w:t>
-      </w:r>
-      <w:r>
-        <w:t xml:space="preserve"> </w:t>
-      </w:r>
-      <w:r>
-        <w:t xml:space="preserve">and</w:t>
-      </w:r>
-      <w:r>
-        <w:t xml:space="preserve"> </w:t>
-      </w:r>
-      <w:r>
-        <w:rPr>
-          <w:rStyle w:val="VerbatimChar"/>
-        </w:rPr>
-        <w:t xml:space="preserve">notebooks/supplement_threshold_sensitivity.ipynb</w:t>
+        <w:t xml:space="preserve">data/threshold_sensitivity.tsv</w:t>
       </w:r>
       <w:r>
         <w:t xml:space="preserve">.</w:t>
       </w:r>
     </w:p>
-    <w:bookmarkEnd w:id="54"/>
-    <w:bookmarkStart w:id="55" w:name="Xc07137d55c8f0b0a748f7e68dd02b803bfc937f"/>
+    <w:bookmarkEnd w:id="99"/>
+    <w:bookmarkStart w:id="100" w:name="Xab864d1aadc6580bf81f3d62ac799c4e2ec3de6"/>
     <w:p>
       <w:pPr>
         <w:pStyle w:val="Heading3"/>
       </w:pPr>
       <w:r>
-        <w:t xml:space="preserve">Supplementary Table S1: Complete Threshold Sensitivity Results</w:t>
+        <w:t xml:space="preserve">Supplementary Table S2: Per-Organism Resolution Summary</w:t>
       </w:r>
     </w:p>
     <w:p>
@@ -4056,53 +4990,7 @@
         <w:pStyle w:val="FirstParagraph"/>
       </w:pPr>
       <w:r>
-        <w:t xml:space="preserve">240 rows covering all combinations of fitness thresholds (5 FIT_THRESHOLD values x 3 T_THRESHOLD values) and BLAST thresholds (4 identity values x 4 coverage values). Each row reports: resolved count, percent resolved, high/medium/low/unresolved counts.</w:t>
-      </w:r>
-    </w:p>
-    <w:p>
-      <w:pPr>
-        <w:pStyle w:val="BodyText"/>
-      </w:pPr>
-      <w:r>
-        <w:t xml:space="preserve">See</w:t>
-      </w:r>
-      <w:r>
-        <w:t xml:space="preserve"> </w:t>
-      </w:r>
-      <w:r>
-        <w:rPr>
-          <w:rStyle w:val="VerbatimChar"/>
-        </w:rPr>
-        <w:t xml:space="preserve">data/threshold_sensitivity.tsv</w:t>
-      </w:r>
-      <w:r>
-        <w:t xml:space="preserve">.</w:t>
-      </w:r>
-    </w:p>
-    <w:bookmarkEnd w:id="55"/>
-    <w:bookmarkStart w:id="56" w:name="Xab864d1aadc6580bf81f3d62ac799c4e2ec3de6"/>
-    <w:p>
-      <w:pPr>
-        <w:pStyle w:val="Heading3"/>
-      </w:pPr>
-      <w:r>
-        <w:t xml:space="preserve">Supplementary Table S2: Per-Organism Resolution Summary</w:t>
-      </w:r>
-    </w:p>
-    <w:p>
-      <w:pPr>
-        <w:pStyle w:val="FirstParagraph"/>
-      </w:pPr>
-      <w:r>
-        <w:t xml:space="preserve">14 rows with total gaps, resolved count, high/medium/low confidence breakdown, and percent resolved per organism.</w:t>
-      </w:r>
-    </w:p>
-    <w:p>
-      <w:pPr>
-        <w:pStyle w:val="BodyText"/>
-      </w:pPr>
-      <w:r>
-        <w:t xml:space="preserve">See</w:t>
+        <w:t xml:space="preserve">14 rows with total gaps, resolved count, high/medium/low confidence breakdown, and percent resolved per organism. See</w:t>
       </w:r>
       <w:r>
         <w:t xml:space="preserve"> </w:t>
@@ -4190,9 +5078,9 @@
         <w:t xml:space="preserve">.</w:t>
       </w:r>
     </w:p>
-    <w:bookmarkEnd w:id="56"/>
-    <w:bookmarkEnd w:id="57"/>
-    <w:bookmarkEnd w:id="58"/>
+    <w:bookmarkEnd w:id="100"/>
+    <w:bookmarkEnd w:id="101"/>
+    <w:bookmarkEnd w:id="102"/>
     <w:sectPr/>
   </w:body>
 </w:document>
@@ -4495,6 +5383,9 @@
     <w:lvlOverride w:ilvl="8">
       <w:startOverride w:val="1"/>
     </w:lvlOverride>
+  </w:num>
+  <w:num w:numId="1003">
+    <w:abstractNumId w:val="991"/>
   </w:num>
 </w:numbering>
 </file>

</xml_diff>